<commit_message>
feat: Adição de novas informações ao relatório
</commit_message>
<xml_diff>
--- a/Relatório dos Projetos.docx
+++ b/Relatório dos Projetos.docx
@@ -1,6 +1,6 @@
 
 <file path=word/document.xml><?xml version="1.0" encoding="utf-8"?>
-<w:document xmlns:wpc="http://schemas.microsoft.com/office/word/2010/wordprocessingCanvas" xmlns:cx="http://schemas.microsoft.com/office/drawing/2014/chartex" xmlns:cx1="http://schemas.microsoft.com/office/drawing/2015/9/8/chartex" xmlns:mc="http://schemas.openxmlformats.org/markup-compatibility/2006" xmlns:o="urn:schemas-microsoft-com:office:office" xmlns:r="http://schemas.openxmlformats.org/officeDocument/2006/relationships" xmlns:m="http://schemas.openxmlformats.org/officeDocument/2006/math" xmlns:v="urn:schemas-microsoft-com:vml" xmlns:wp14="http://schemas.microsoft.com/office/word/2010/wordprocessingDrawing" xmlns:wp="http://schemas.openxmlformats.org/drawingml/2006/wordprocessingDrawing" xmlns:w10="urn:schemas-microsoft-com:office:word" xmlns:w="http://schemas.openxmlformats.org/wordprocessingml/2006/main" xmlns:w14="http://schemas.microsoft.com/office/word/2010/wordml" xmlns:w15="http://schemas.microsoft.com/office/word/2012/wordml" xmlns:w16se="http://schemas.microsoft.com/office/word/2015/wordml/symex" xmlns:wpg="http://schemas.microsoft.com/office/word/2010/wordprocessingGroup" xmlns:wpi="http://schemas.microsoft.com/office/word/2010/wordprocessingInk" xmlns:wne="http://schemas.microsoft.com/office/word/2006/wordml" xmlns:wps="http://schemas.microsoft.com/office/word/2010/wordprocessingShape" mc:Ignorable="w14 w15 w16se wp14">
+<w:document xmlns:wpc="http://schemas.microsoft.com/office/word/2010/wordprocessingCanvas" xmlns:cx="http://schemas.microsoft.com/office/drawing/2014/chartex" xmlns:cx1="http://schemas.microsoft.com/office/drawing/2015/9/8/chartex" xmlns:cx2="http://schemas.microsoft.com/office/drawing/2015/10/21/chartex" xmlns:cx3="http://schemas.microsoft.com/office/drawing/2016/5/9/chartex" xmlns:cx4="http://schemas.microsoft.com/office/drawing/2016/5/10/chartex" xmlns:cx5="http://schemas.microsoft.com/office/drawing/2016/5/11/chartex" xmlns:cx6="http://schemas.microsoft.com/office/drawing/2016/5/12/chartex" xmlns:cx7="http://schemas.microsoft.com/office/drawing/2016/5/13/chartex" xmlns:cx8="http://schemas.microsoft.com/office/drawing/2016/5/14/chartex" xmlns:mc="http://schemas.openxmlformats.org/markup-compatibility/2006" xmlns:aink="http://schemas.microsoft.com/office/drawing/2016/ink" xmlns:am3d="http://schemas.microsoft.com/office/drawing/2017/model3d" xmlns:o="urn:schemas-microsoft-com:office:office" xmlns:r="http://schemas.openxmlformats.org/officeDocument/2006/relationships" xmlns:m="http://schemas.openxmlformats.org/officeDocument/2006/math" xmlns:v="urn:schemas-microsoft-com:vml" xmlns:wp14="http://schemas.microsoft.com/office/word/2010/wordprocessingDrawing" xmlns:wp="http://schemas.openxmlformats.org/drawingml/2006/wordprocessingDrawing" xmlns:w10="urn:schemas-microsoft-com:office:word" xmlns:w="http://schemas.openxmlformats.org/wordprocessingml/2006/main" xmlns:w14="http://schemas.microsoft.com/office/word/2010/wordml" xmlns:w15="http://schemas.microsoft.com/office/word/2012/wordml" xmlns:w16cex="http://schemas.microsoft.com/office/word/2018/wordml/cex" xmlns:w16cid="http://schemas.microsoft.com/office/word/2016/wordml/cid" xmlns:w16="http://schemas.microsoft.com/office/word/2018/wordml" xmlns:w16sdtdh="http://schemas.microsoft.com/office/word/2020/wordml/sdtdatahash" xmlns:w16se="http://schemas.microsoft.com/office/word/2015/wordml/symex" xmlns:wpg="http://schemas.microsoft.com/office/word/2010/wordprocessingGroup" xmlns:wpi="http://schemas.microsoft.com/office/word/2010/wordprocessingInk" xmlns:wne="http://schemas.microsoft.com/office/word/2006/wordml" xmlns:wps="http://schemas.microsoft.com/office/word/2010/wordprocessingShape" mc:Ignorable="w14 w15 w16se w16cid w16 w16cex w16sdtdh wp14">
   <w:body>
     <w:p>
       <w:pPr>
@@ -941,7 +941,25 @@
           <w:sz w:val="24"/>
           <w:szCs w:val="24"/>
         </w:rPr>
-        <w:t>Prof. MSc. Gabriel Passos de Jesus</w:t>
+        <w:t xml:space="preserve">Prof. </w:t>
+      </w:r>
+      <w:proofErr w:type="spellStart"/>
+      <w:r>
+        <w:rPr>
+          <w:rFonts w:ascii="Arial" w:hAnsi="Arial" w:cs="Arial"/>
+          <w:sz w:val="24"/>
+          <w:szCs w:val="24"/>
+        </w:rPr>
+        <w:t>MSc</w:t>
+      </w:r>
+      <w:proofErr w:type="spellEnd"/>
+      <w:r>
+        <w:rPr>
+          <w:rFonts w:ascii="Arial" w:hAnsi="Arial" w:cs="Arial"/>
+          <w:sz w:val="24"/>
+          <w:szCs w:val="24"/>
+        </w:rPr>
+        <w:t>. Gabriel Passos de Jesus</w:t>
       </w:r>
     </w:p>
     <w:p>
@@ -1150,8 +1168,6 @@
             </w:rPr>
             <w:t>Sumário</w:t>
           </w:r>
-          <w:bookmarkStart w:id="0" w:name="_GoBack"/>
-          <w:bookmarkEnd w:id="0"/>
         </w:p>
         <w:p>
           <w:pPr>
@@ -1184,7 +1200,7 @@
             </w:rPr>
             <w:fldChar w:fldCharType="separate"/>
           </w:r>
-          <w:hyperlink w:anchor="_Toc225522014" w:history="1">
+          <w:hyperlink w:anchor="_Toc225587735" w:history="1">
             <w:r>
               <w:rPr>
                 <w:rStyle w:val="Hyperlink"/>
@@ -1232,7 +1248,7 @@
                 <w:noProof/>
                 <w:webHidden/>
               </w:rPr>
-              <w:instrText xml:space="preserve"> PAGEREF _Toc225522014 \h </w:instrText>
+              <w:instrText xml:space="preserve"> PAGEREF _Toc225587735 \h </w:instrText>
             </w:r>
             <w:r>
               <w:rPr>
@@ -1276,7 +1292,7 @@
               <w:lang w:eastAsia="pt-BR"/>
             </w:rPr>
           </w:pPr>
-          <w:hyperlink w:anchor="_Toc225522015" w:history="1">
+          <w:hyperlink w:anchor="_Toc225587736" w:history="1">
             <w:r>
               <w:rPr>
                 <w:rStyle w:val="Hyperlink"/>
@@ -1324,7 +1340,7 @@
                 <w:noProof/>
                 <w:webHidden/>
               </w:rPr>
-              <w:instrText xml:space="preserve"> PAGEREF _Toc225522015 \h </w:instrText>
+              <w:instrText xml:space="preserve"> PAGEREF _Toc225587736 \h </w:instrText>
             </w:r>
             <w:r>
               <w:rPr>
@@ -1368,7 +1384,7 @@
               <w:lang w:eastAsia="pt-BR"/>
             </w:rPr>
           </w:pPr>
-          <w:hyperlink w:anchor="_Toc225522016" w:history="1">
+          <w:hyperlink w:anchor="_Toc225587737" w:history="1">
             <w:r>
               <w:rPr>
                 <w:rStyle w:val="Hyperlink"/>
@@ -1412,7 +1428,7 @@
                 <w:noProof/>
                 <w:webHidden/>
               </w:rPr>
-              <w:instrText xml:space="preserve"> PAGEREF _Toc225522016 \h </w:instrText>
+              <w:instrText xml:space="preserve"> PAGEREF _Toc225587737 \h </w:instrText>
             </w:r>
             <w:r>
               <w:rPr>
@@ -1456,7 +1472,7 @@
               <w:lang w:eastAsia="pt-BR"/>
             </w:rPr>
           </w:pPr>
-          <w:hyperlink w:anchor="_Toc225522017" w:history="1">
+          <w:hyperlink w:anchor="_Toc225587738" w:history="1">
             <w:r>
               <w:rPr>
                 <w:rStyle w:val="Hyperlink"/>
@@ -1500,7 +1516,7 @@
                 <w:noProof/>
                 <w:webHidden/>
               </w:rPr>
-              <w:instrText xml:space="preserve"> PAGEREF _Toc225522017 \h </w:instrText>
+              <w:instrText xml:space="preserve"> PAGEREF _Toc225587738 \h </w:instrText>
             </w:r>
             <w:r>
               <w:rPr>
@@ -1544,7 +1560,7 @@
               <w:lang w:eastAsia="pt-BR"/>
             </w:rPr>
           </w:pPr>
-          <w:hyperlink w:anchor="_Toc225522018" w:history="1">
+          <w:hyperlink w:anchor="_Toc225587739" w:history="1">
             <w:r>
               <w:rPr>
                 <w:rStyle w:val="Hyperlink"/>
@@ -1588,7 +1604,7 @@
                 <w:noProof/>
                 <w:webHidden/>
               </w:rPr>
-              <w:instrText xml:space="preserve"> PAGEREF _Toc225522018 \h </w:instrText>
+              <w:instrText xml:space="preserve"> PAGEREF _Toc225587739 \h </w:instrText>
             </w:r>
             <w:r>
               <w:rPr>
@@ -1632,7 +1648,7 @@
               <w:lang w:eastAsia="pt-BR"/>
             </w:rPr>
           </w:pPr>
-          <w:hyperlink w:anchor="_Toc225522019" w:history="1">
+          <w:hyperlink w:anchor="_Toc225587740" w:history="1">
             <w:r>
               <w:rPr>
                 <w:rStyle w:val="Hyperlink"/>
@@ -1676,7 +1692,7 @@
                 <w:noProof/>
                 <w:webHidden/>
               </w:rPr>
-              <w:instrText xml:space="preserve"> PAGEREF _Toc225522019 \h </w:instrText>
+              <w:instrText xml:space="preserve"> PAGEREF _Toc225587740 \h </w:instrText>
             </w:r>
             <w:r>
               <w:rPr>
@@ -1720,7 +1736,7 @@
               <w:lang w:eastAsia="pt-BR"/>
             </w:rPr>
           </w:pPr>
-          <w:hyperlink w:anchor="_Toc225522020" w:history="1">
+          <w:hyperlink w:anchor="_Toc225587741" w:history="1">
             <w:r>
               <w:rPr>
                 <w:rStyle w:val="Hyperlink"/>
@@ -1764,7 +1780,7 @@
                 <w:noProof/>
                 <w:webHidden/>
               </w:rPr>
-              <w:instrText xml:space="preserve"> PAGEREF _Toc225522020 \h </w:instrText>
+              <w:instrText xml:space="preserve"> PAGEREF _Toc225587741 \h </w:instrText>
             </w:r>
             <w:r>
               <w:rPr>
@@ -1808,7 +1824,7 @@
               <w:lang w:eastAsia="pt-BR"/>
             </w:rPr>
           </w:pPr>
-          <w:hyperlink w:anchor="_Toc225522021" w:history="1">
+          <w:hyperlink w:anchor="_Toc225587742" w:history="1">
             <w:r>
               <w:rPr>
                 <w:rStyle w:val="Hyperlink"/>
@@ -1852,7 +1868,7 @@
                 <w:noProof/>
                 <w:webHidden/>
               </w:rPr>
-              <w:instrText xml:space="preserve"> PAGEREF _Toc225522021 \h </w:instrText>
+              <w:instrText xml:space="preserve"> PAGEREF _Toc225587742 \h </w:instrText>
             </w:r>
             <w:r>
               <w:rPr>
@@ -1896,7 +1912,7 @@
               <w:lang w:eastAsia="pt-BR"/>
             </w:rPr>
           </w:pPr>
-          <w:hyperlink w:anchor="_Toc225522022" w:history="1">
+          <w:hyperlink w:anchor="_Toc225587743" w:history="1">
             <w:r>
               <w:rPr>
                 <w:rStyle w:val="Hyperlink"/>
@@ -1940,7 +1956,7 @@
                 <w:noProof/>
                 <w:webHidden/>
               </w:rPr>
-              <w:instrText xml:space="preserve"> PAGEREF _Toc225522022 \h </w:instrText>
+              <w:instrText xml:space="preserve"> PAGEREF _Toc225587743 \h </w:instrText>
             </w:r>
             <w:r>
               <w:rPr>
@@ -1984,7 +2000,7 @@
               <w:lang w:eastAsia="pt-BR"/>
             </w:rPr>
           </w:pPr>
-          <w:hyperlink w:anchor="_Toc225522023" w:history="1">
+          <w:hyperlink w:anchor="_Toc225587744" w:history="1">
             <w:r>
               <w:rPr>
                 <w:rStyle w:val="Hyperlink"/>
@@ -2032,7 +2048,7 @@
                 <w:noProof/>
                 <w:webHidden/>
               </w:rPr>
-              <w:instrText xml:space="preserve"> PAGEREF _Toc225522023 \h </w:instrText>
+              <w:instrText xml:space="preserve"> PAGEREF _Toc225587744 \h </w:instrText>
             </w:r>
             <w:r>
               <w:rPr>
@@ -2076,7 +2092,7 @@
               <w:lang w:eastAsia="pt-BR"/>
             </w:rPr>
           </w:pPr>
-          <w:hyperlink w:anchor="_Toc225522024" w:history="1">
+          <w:hyperlink w:anchor="_Toc225587745" w:history="1">
             <w:r>
               <w:rPr>
                 <w:rStyle w:val="Hyperlink"/>
@@ -2120,7 +2136,7 @@
                 <w:noProof/>
                 <w:webHidden/>
               </w:rPr>
-              <w:instrText xml:space="preserve"> PAGEREF _Toc225522024 \h </w:instrText>
+              <w:instrText xml:space="preserve"> PAGEREF _Toc225587745 \h </w:instrText>
             </w:r>
             <w:r>
               <w:rPr>
@@ -2164,7 +2180,7 @@
               <w:lang w:eastAsia="pt-BR"/>
             </w:rPr>
           </w:pPr>
-          <w:hyperlink w:anchor="_Toc225522025" w:history="1">
+          <w:hyperlink w:anchor="_Toc225587746" w:history="1">
             <w:r>
               <w:rPr>
                 <w:rStyle w:val="Hyperlink"/>
@@ -2208,7 +2224,7 @@
                 <w:noProof/>
                 <w:webHidden/>
               </w:rPr>
-              <w:instrText xml:space="preserve"> PAGEREF _Toc225522025 \h </w:instrText>
+              <w:instrText xml:space="preserve"> PAGEREF _Toc225587746 \h </w:instrText>
             </w:r>
             <w:r>
               <w:rPr>
@@ -2252,7 +2268,7 @@
               <w:lang w:eastAsia="pt-BR"/>
             </w:rPr>
           </w:pPr>
-          <w:hyperlink w:anchor="_Toc225522026" w:history="1">
+          <w:hyperlink w:anchor="_Toc225587747" w:history="1">
             <w:r>
               <w:rPr>
                 <w:rStyle w:val="Hyperlink"/>
@@ -2296,7 +2312,7 @@
                 <w:noProof/>
                 <w:webHidden/>
               </w:rPr>
-              <w:instrText xml:space="preserve"> PAGEREF _Toc225522026 \h </w:instrText>
+              <w:instrText xml:space="preserve"> PAGEREF _Toc225587747 \h </w:instrText>
             </w:r>
             <w:r>
               <w:rPr>
@@ -2340,7 +2356,7 @@
               <w:lang w:eastAsia="pt-BR"/>
             </w:rPr>
           </w:pPr>
-          <w:hyperlink w:anchor="_Toc225522027" w:history="1">
+          <w:hyperlink w:anchor="_Toc225587748" w:history="1">
             <w:r>
               <w:rPr>
                 <w:rStyle w:val="Hyperlink"/>
@@ -2384,7 +2400,7 @@
                 <w:noProof/>
                 <w:webHidden/>
               </w:rPr>
-              <w:instrText xml:space="preserve"> PAGEREF _Toc225522027 \h </w:instrText>
+              <w:instrText xml:space="preserve"> PAGEREF _Toc225587748 \h </w:instrText>
             </w:r>
             <w:r>
               <w:rPr>
@@ -2428,7 +2444,7 @@
               <w:lang w:eastAsia="pt-BR"/>
             </w:rPr>
           </w:pPr>
-          <w:hyperlink w:anchor="_Toc225522028" w:history="1">
+          <w:hyperlink w:anchor="_Toc225587749" w:history="1">
             <w:r>
               <w:rPr>
                 <w:rStyle w:val="Hyperlink"/>
@@ -2472,7 +2488,7 @@
                 <w:noProof/>
                 <w:webHidden/>
               </w:rPr>
-              <w:instrText xml:space="preserve"> PAGEREF _Toc225522028 \h </w:instrText>
+              <w:instrText xml:space="preserve"> PAGEREF _Toc225587749 \h </w:instrText>
             </w:r>
             <w:r>
               <w:rPr>
@@ -2516,7 +2532,7 @@
               <w:lang w:eastAsia="pt-BR"/>
             </w:rPr>
           </w:pPr>
-          <w:hyperlink w:anchor="_Toc225522029" w:history="1">
+          <w:hyperlink w:anchor="_Toc225587750" w:history="1">
             <w:r>
               <w:rPr>
                 <w:rStyle w:val="Hyperlink"/>
@@ -2560,7 +2576,7 @@
                 <w:noProof/>
                 <w:webHidden/>
               </w:rPr>
-              <w:instrText xml:space="preserve"> PAGEREF _Toc225522029 \h </w:instrText>
+              <w:instrText xml:space="preserve"> PAGEREF _Toc225587750 \h </w:instrText>
             </w:r>
             <w:r>
               <w:rPr>
@@ -2604,7 +2620,7 @@
               <w:lang w:eastAsia="pt-BR"/>
             </w:rPr>
           </w:pPr>
-          <w:hyperlink w:anchor="_Toc225522030" w:history="1">
+          <w:hyperlink w:anchor="_Toc225587751" w:history="1">
             <w:r>
               <w:rPr>
                 <w:rStyle w:val="Hyperlink"/>
@@ -2648,7 +2664,7 @@
                 <w:noProof/>
                 <w:webHidden/>
               </w:rPr>
-              <w:instrText xml:space="preserve"> PAGEREF _Toc225522030 \h </w:instrText>
+              <w:instrText xml:space="preserve"> PAGEREF _Toc225587751 \h </w:instrText>
             </w:r>
             <w:r>
               <w:rPr>
@@ -2692,7 +2708,7 @@
               <w:lang w:eastAsia="pt-BR"/>
             </w:rPr>
           </w:pPr>
-          <w:hyperlink w:anchor="_Toc225522031" w:history="1">
+          <w:hyperlink w:anchor="_Toc225587752" w:history="1">
             <w:r>
               <w:rPr>
                 <w:rStyle w:val="Hyperlink"/>
@@ -2740,7 +2756,7 @@
                 <w:noProof/>
                 <w:webHidden/>
               </w:rPr>
-              <w:instrText xml:space="preserve"> PAGEREF _Toc225522031 \h </w:instrText>
+              <w:instrText xml:space="preserve"> PAGEREF _Toc225587752 \h </w:instrText>
             </w:r>
             <w:r>
               <w:rPr>
@@ -2784,7 +2800,7 @@
               <w:lang w:eastAsia="pt-BR"/>
             </w:rPr>
           </w:pPr>
-          <w:hyperlink w:anchor="_Toc225522032" w:history="1">
+          <w:hyperlink w:anchor="_Toc225587753" w:history="1">
             <w:r>
               <w:rPr>
                 <w:rStyle w:val="Hyperlink"/>
@@ -2828,7 +2844,7 @@
                 <w:noProof/>
                 <w:webHidden/>
               </w:rPr>
-              <w:instrText xml:space="preserve"> PAGEREF _Toc225522032 \h </w:instrText>
+              <w:instrText xml:space="preserve"> PAGEREF _Toc225587753 \h </w:instrText>
             </w:r>
             <w:r>
               <w:rPr>
@@ -2872,7 +2888,7 @@
               <w:lang w:eastAsia="pt-BR"/>
             </w:rPr>
           </w:pPr>
-          <w:hyperlink w:anchor="_Toc225522033" w:history="1">
+          <w:hyperlink w:anchor="_Toc225587754" w:history="1">
             <w:r>
               <w:rPr>
                 <w:rStyle w:val="Hyperlink"/>
@@ -2916,7 +2932,7 @@
                 <w:noProof/>
                 <w:webHidden/>
               </w:rPr>
-              <w:instrText xml:space="preserve"> PAGEREF _Toc225522033 \h </w:instrText>
+              <w:instrText xml:space="preserve"> PAGEREF _Toc225587754 \h </w:instrText>
             </w:r>
             <w:r>
               <w:rPr>
@@ -2960,7 +2976,7 @@
               <w:lang w:eastAsia="pt-BR"/>
             </w:rPr>
           </w:pPr>
-          <w:hyperlink w:anchor="_Toc225522034" w:history="1">
+          <w:hyperlink w:anchor="_Toc225587755" w:history="1">
             <w:r>
               <w:rPr>
                 <w:rStyle w:val="Hyperlink"/>
@@ -3004,7 +3020,7 @@
                 <w:noProof/>
                 <w:webHidden/>
               </w:rPr>
-              <w:instrText xml:space="preserve"> PAGEREF _Toc225522034 \h </w:instrText>
+              <w:instrText xml:space="preserve"> PAGEREF _Toc225587755 \h </w:instrText>
             </w:r>
             <w:r>
               <w:rPr>
@@ -3048,7 +3064,7 @@
               <w:lang w:eastAsia="pt-BR"/>
             </w:rPr>
           </w:pPr>
-          <w:hyperlink w:anchor="_Toc225522035" w:history="1">
+          <w:hyperlink w:anchor="_Toc225587756" w:history="1">
             <w:r>
               <w:rPr>
                 <w:rStyle w:val="Hyperlink"/>
@@ -3092,7 +3108,7 @@
                 <w:noProof/>
                 <w:webHidden/>
               </w:rPr>
-              <w:instrText xml:space="preserve"> PAGEREF _Toc225522035 \h </w:instrText>
+              <w:instrText xml:space="preserve"> PAGEREF _Toc225587756 \h </w:instrText>
             </w:r>
             <w:r>
               <w:rPr>
@@ -3136,7 +3152,7 @@
               <w:lang w:eastAsia="pt-BR"/>
             </w:rPr>
           </w:pPr>
-          <w:hyperlink w:anchor="_Toc225522036" w:history="1">
+          <w:hyperlink w:anchor="_Toc225587757" w:history="1">
             <w:r>
               <w:rPr>
                 <w:rStyle w:val="Hyperlink"/>
@@ -3180,7 +3196,7 @@
                 <w:noProof/>
                 <w:webHidden/>
               </w:rPr>
-              <w:instrText xml:space="preserve"> PAGEREF _Toc225522036 \h </w:instrText>
+              <w:instrText xml:space="preserve"> PAGEREF _Toc225587757 \h </w:instrText>
             </w:r>
             <w:r>
               <w:rPr>
@@ -3224,7 +3240,7 @@
               <w:lang w:eastAsia="pt-BR"/>
             </w:rPr>
           </w:pPr>
-          <w:hyperlink w:anchor="_Toc225522037" w:history="1">
+          <w:hyperlink w:anchor="_Toc225587758" w:history="1">
             <w:r>
               <w:rPr>
                 <w:rStyle w:val="Hyperlink"/>
@@ -3268,7 +3284,7 @@
                 <w:noProof/>
                 <w:webHidden/>
               </w:rPr>
-              <w:instrText xml:space="preserve"> PAGEREF _Toc225522037 \h </w:instrText>
+              <w:instrText xml:space="preserve"> PAGEREF _Toc225587758 \h </w:instrText>
             </w:r>
             <w:r>
               <w:rPr>
@@ -3312,7 +3328,7 @@
               <w:lang w:eastAsia="pt-BR"/>
             </w:rPr>
           </w:pPr>
-          <w:hyperlink w:anchor="_Toc225522038" w:history="1">
+          <w:hyperlink w:anchor="_Toc225587759" w:history="1">
             <w:r>
               <w:rPr>
                 <w:rStyle w:val="Hyperlink"/>
@@ -3356,7 +3372,7 @@
                 <w:noProof/>
                 <w:webHidden/>
               </w:rPr>
-              <w:instrText xml:space="preserve"> PAGEREF _Toc225522038 \h </w:instrText>
+              <w:instrText xml:space="preserve"> PAGEREF _Toc225587759 \h </w:instrText>
             </w:r>
             <w:r>
               <w:rPr>
@@ -3400,7 +3416,7 @@
               <w:lang w:eastAsia="pt-BR"/>
             </w:rPr>
           </w:pPr>
-          <w:hyperlink w:anchor="_Toc225522039" w:history="1">
+          <w:hyperlink w:anchor="_Toc225587760" w:history="1">
             <w:r>
               <w:rPr>
                 <w:rStyle w:val="Hyperlink"/>
@@ -3448,7 +3464,7 @@
                 <w:noProof/>
                 <w:webHidden/>
               </w:rPr>
-              <w:instrText xml:space="preserve"> PAGEREF _Toc225522039 \h </w:instrText>
+              <w:instrText xml:space="preserve"> PAGEREF _Toc225587760 \h </w:instrText>
             </w:r>
             <w:r>
               <w:rPr>
@@ -3541,7 +3557,7 @@
           <w:szCs w:val="24"/>
         </w:rPr>
       </w:pPr>
-      <w:bookmarkStart w:id="1" w:name="_Toc225522014"/>
+      <w:bookmarkStart w:id="0" w:name="_Toc225587735"/>
       <w:r>
         <w:rPr>
           <w:rFonts w:ascii="Arial" w:hAnsi="Arial" w:cs="Arial"/>
@@ -3554,7 +3570,7 @@
         <w:lastRenderedPageBreak/>
         <w:t>Introdução Geral</w:t>
       </w:r>
-      <w:bookmarkEnd w:id="1"/>
+      <w:bookmarkEnd w:id="0"/>
     </w:p>
     <w:p>
       <w:pPr>
@@ -3766,7 +3782,7 @@
           <w:szCs w:val="24"/>
         </w:rPr>
       </w:pPr>
-      <w:bookmarkStart w:id="2" w:name="_Toc225522015"/>
+      <w:bookmarkStart w:id="1" w:name="_Toc225587736"/>
       <w:r>
         <w:rPr>
           <w:rFonts w:ascii="Arial" w:hAnsi="Arial" w:cs="Arial"/>
@@ -3779,7 +3795,7 @@
         <w:lastRenderedPageBreak/>
         <w:t>Projeto I - Árvores</w:t>
       </w:r>
-      <w:bookmarkEnd w:id="2"/>
+      <w:bookmarkEnd w:id="1"/>
     </w:p>
     <w:p>
       <w:pPr>
@@ -3797,7 +3813,7 @@
           <w:szCs w:val="24"/>
         </w:rPr>
       </w:pPr>
-      <w:bookmarkStart w:id="3" w:name="_Toc225522016"/>
+      <w:bookmarkStart w:id="2" w:name="_Toc225587737"/>
       <w:r>
         <w:rPr>
           <w:rFonts w:ascii="Arial" w:hAnsi="Arial" w:cs="Arial"/>
@@ -3807,7 +3823,7 @@
         </w:rPr>
         <w:t>Introdução</w:t>
       </w:r>
-      <w:bookmarkEnd w:id="3"/>
+      <w:bookmarkEnd w:id="2"/>
     </w:p>
     <w:p>
       <w:pPr>
@@ -3825,7 +3841,7 @@
           <w:szCs w:val="24"/>
         </w:rPr>
       </w:pPr>
-      <w:bookmarkStart w:id="4" w:name="_Toc225522017"/>
+      <w:bookmarkStart w:id="3" w:name="_Toc225587738"/>
       <w:r>
         <w:rPr>
           <w:rFonts w:ascii="Arial" w:hAnsi="Arial" w:cs="Arial"/>
@@ -3835,7 +3851,7 @@
         </w:rPr>
         <w:t>Fundamentação Teórica</w:t>
       </w:r>
-      <w:bookmarkEnd w:id="4"/>
+      <w:bookmarkEnd w:id="3"/>
     </w:p>
     <w:p>
       <w:pPr>
@@ -3853,7 +3869,7 @@
           <w:szCs w:val="24"/>
         </w:rPr>
       </w:pPr>
-      <w:bookmarkStart w:id="5" w:name="_Toc225522018"/>
+      <w:bookmarkStart w:id="4" w:name="_Toc225587739"/>
       <w:r>
         <w:rPr>
           <w:rFonts w:ascii="Arial" w:hAnsi="Arial" w:cs="Arial"/>
@@ -3863,7 +3879,7 @@
         </w:rPr>
         <w:t>Análise Assintótica</w:t>
       </w:r>
-      <w:bookmarkEnd w:id="5"/>
+      <w:bookmarkEnd w:id="4"/>
     </w:p>
     <w:p>
       <w:pPr>
@@ -3881,7 +3897,7 @@
           <w:szCs w:val="24"/>
         </w:rPr>
       </w:pPr>
-      <w:bookmarkStart w:id="6" w:name="_Toc225522019"/>
+      <w:bookmarkStart w:id="5" w:name="_Toc225587740"/>
       <w:r>
         <w:rPr>
           <w:rFonts w:ascii="Arial" w:hAnsi="Arial" w:cs="Arial"/>
@@ -3891,7 +3907,7 @@
         </w:rPr>
         <w:t>Metodologia Experimental</w:t>
       </w:r>
-      <w:bookmarkEnd w:id="6"/>
+      <w:bookmarkEnd w:id="5"/>
     </w:p>
     <w:p>
       <w:pPr>
@@ -3909,7 +3925,7 @@
           <w:szCs w:val="24"/>
         </w:rPr>
       </w:pPr>
-      <w:bookmarkStart w:id="7" w:name="_Toc225522020"/>
+      <w:bookmarkStart w:id="6" w:name="_Toc225587741"/>
       <w:r>
         <w:rPr>
           <w:rFonts w:ascii="Arial" w:hAnsi="Arial" w:cs="Arial"/>
@@ -3919,7 +3935,7 @@
         </w:rPr>
         <w:t>Resultados</w:t>
       </w:r>
-      <w:bookmarkEnd w:id="7"/>
+      <w:bookmarkEnd w:id="6"/>
     </w:p>
     <w:p>
       <w:pPr>
@@ -3937,7 +3953,7 @@
           <w:szCs w:val="24"/>
         </w:rPr>
       </w:pPr>
-      <w:bookmarkStart w:id="8" w:name="_Toc225522021"/>
+      <w:bookmarkStart w:id="7" w:name="_Toc225587742"/>
       <w:r>
         <w:rPr>
           <w:rFonts w:ascii="Arial" w:hAnsi="Arial" w:cs="Arial"/>
@@ -3947,7 +3963,7 @@
         </w:rPr>
         <w:t>Discussão</w:t>
       </w:r>
-      <w:bookmarkEnd w:id="8"/>
+      <w:bookmarkEnd w:id="7"/>
     </w:p>
     <w:p>
       <w:pPr>
@@ -3965,7 +3981,7 @@
           <w:szCs w:val="24"/>
         </w:rPr>
       </w:pPr>
-      <w:bookmarkStart w:id="9" w:name="_Toc225522022"/>
+      <w:bookmarkStart w:id="8" w:name="_Toc225587743"/>
       <w:r>
         <w:rPr>
           <w:rFonts w:ascii="Arial" w:hAnsi="Arial" w:cs="Arial"/>
@@ -3975,7 +3991,7 @@
         </w:rPr>
         <w:t>Conclusão</w:t>
       </w:r>
-      <w:bookmarkEnd w:id="9"/>
+      <w:bookmarkEnd w:id="8"/>
     </w:p>
     <w:p>
       <w:pPr>
@@ -4166,7 +4182,7 @@
           <w:szCs w:val="24"/>
         </w:rPr>
       </w:pPr>
-      <w:bookmarkStart w:id="10" w:name="_Toc225522023"/>
+      <w:bookmarkStart w:id="9" w:name="_Toc225587744"/>
       <w:r>
         <w:rPr>
           <w:rFonts w:ascii="Arial" w:hAnsi="Arial" w:cs="Arial"/>
@@ -4179,7 +4195,7 @@
         <w:lastRenderedPageBreak/>
         <w:t>Projeto II - Buscas</w:t>
       </w:r>
-      <w:bookmarkEnd w:id="10"/>
+      <w:bookmarkEnd w:id="9"/>
     </w:p>
     <w:p>
       <w:pPr>
@@ -4197,7 +4213,7 @@
           <w:szCs w:val="24"/>
         </w:rPr>
       </w:pPr>
-      <w:bookmarkStart w:id="11" w:name="_Toc225522024"/>
+      <w:bookmarkStart w:id="10" w:name="_Toc225587745"/>
       <w:r>
         <w:rPr>
           <w:rFonts w:ascii="Arial" w:hAnsi="Arial" w:cs="Arial"/>
@@ -4207,7 +4223,7 @@
         </w:rPr>
         <w:t>Introdução</w:t>
       </w:r>
-      <w:bookmarkEnd w:id="11"/>
+      <w:bookmarkEnd w:id="10"/>
     </w:p>
     <w:p>
       <w:pPr>
@@ -4225,7 +4241,7 @@
           <w:szCs w:val="24"/>
         </w:rPr>
       </w:pPr>
-      <w:bookmarkStart w:id="12" w:name="_Toc225522025"/>
+      <w:bookmarkStart w:id="11" w:name="_Toc225587746"/>
       <w:r>
         <w:rPr>
           <w:rFonts w:ascii="Arial" w:hAnsi="Arial" w:cs="Arial"/>
@@ -4235,7 +4251,7 @@
         </w:rPr>
         <w:t>Fundamentação Teórica</w:t>
       </w:r>
-      <w:bookmarkEnd w:id="12"/>
+      <w:bookmarkEnd w:id="11"/>
     </w:p>
     <w:p>
       <w:pPr>
@@ -4253,7 +4269,7 @@
           <w:szCs w:val="24"/>
         </w:rPr>
       </w:pPr>
-      <w:bookmarkStart w:id="13" w:name="_Toc225522026"/>
+      <w:bookmarkStart w:id="12" w:name="_Toc225587747"/>
       <w:r>
         <w:rPr>
           <w:rFonts w:ascii="Arial" w:hAnsi="Arial" w:cs="Arial"/>
@@ -4263,7 +4279,7 @@
         </w:rPr>
         <w:t>Análise Assintótica</w:t>
       </w:r>
-      <w:bookmarkEnd w:id="13"/>
+      <w:bookmarkEnd w:id="12"/>
     </w:p>
     <w:p>
       <w:pPr>
@@ -4281,7 +4297,7 @@
           <w:szCs w:val="24"/>
         </w:rPr>
       </w:pPr>
-      <w:bookmarkStart w:id="14" w:name="_Toc225522027"/>
+      <w:bookmarkStart w:id="13" w:name="_Toc225587748"/>
       <w:r>
         <w:rPr>
           <w:rFonts w:ascii="Arial" w:hAnsi="Arial" w:cs="Arial"/>
@@ -4291,7 +4307,7 @@
         </w:rPr>
         <w:t>Metodologia Experimental</w:t>
       </w:r>
-      <w:bookmarkEnd w:id="14"/>
+      <w:bookmarkEnd w:id="13"/>
     </w:p>
     <w:p>
       <w:pPr>
@@ -4309,7 +4325,7 @@
           <w:szCs w:val="24"/>
         </w:rPr>
       </w:pPr>
-      <w:bookmarkStart w:id="15" w:name="_Toc225522028"/>
+      <w:bookmarkStart w:id="14" w:name="_Toc225587749"/>
       <w:r>
         <w:rPr>
           <w:rFonts w:ascii="Arial" w:hAnsi="Arial" w:cs="Arial"/>
@@ -4319,7 +4335,7 @@
         </w:rPr>
         <w:t>Resultados</w:t>
       </w:r>
-      <w:bookmarkEnd w:id="15"/>
+      <w:bookmarkEnd w:id="14"/>
     </w:p>
     <w:p>
       <w:pPr>
@@ -4337,7 +4353,7 @@
           <w:szCs w:val="24"/>
         </w:rPr>
       </w:pPr>
-      <w:bookmarkStart w:id="16" w:name="_Toc225522029"/>
+      <w:bookmarkStart w:id="15" w:name="_Toc225587750"/>
       <w:r>
         <w:rPr>
           <w:rFonts w:ascii="Arial" w:hAnsi="Arial" w:cs="Arial"/>
@@ -4347,7 +4363,7 @@
         </w:rPr>
         <w:t>Discussão</w:t>
       </w:r>
-      <w:bookmarkEnd w:id="16"/>
+      <w:bookmarkEnd w:id="15"/>
     </w:p>
     <w:p>
       <w:pPr>
@@ -4365,7 +4381,7 @@
           <w:szCs w:val="24"/>
         </w:rPr>
       </w:pPr>
-      <w:bookmarkStart w:id="17" w:name="_Toc225522030"/>
+      <w:bookmarkStart w:id="16" w:name="_Toc225587751"/>
       <w:r>
         <w:rPr>
           <w:rFonts w:ascii="Arial" w:hAnsi="Arial" w:cs="Arial"/>
@@ -4375,7 +4391,7 @@
         </w:rPr>
         <w:t>Conclusão</w:t>
       </w:r>
-      <w:bookmarkEnd w:id="17"/>
+      <w:bookmarkEnd w:id="16"/>
     </w:p>
     <w:p>
       <w:pPr>
@@ -4549,7 +4565,7 @@
           <w:szCs w:val="24"/>
         </w:rPr>
       </w:pPr>
-      <w:bookmarkStart w:id="18" w:name="_Toc225522031"/>
+      <w:bookmarkStart w:id="17" w:name="_Toc225587752"/>
       <w:r>
         <w:rPr>
           <w:rFonts w:ascii="Arial" w:hAnsi="Arial" w:cs="Arial"/>
@@ -4562,7 +4578,7 @@
         <w:lastRenderedPageBreak/>
         <w:t>Projeto III - Ordenação</w:t>
       </w:r>
-      <w:bookmarkEnd w:id="18"/>
+      <w:bookmarkEnd w:id="17"/>
     </w:p>
     <w:p>
       <w:pPr>
@@ -4580,7 +4596,7 @@
           <w:szCs w:val="24"/>
         </w:rPr>
       </w:pPr>
-      <w:bookmarkStart w:id="19" w:name="_Toc225522032"/>
+      <w:bookmarkStart w:id="18" w:name="_Toc225587753"/>
       <w:r>
         <w:rPr>
           <w:rFonts w:ascii="Arial" w:hAnsi="Arial" w:cs="Arial"/>
@@ -4590,7 +4606,7 @@
         </w:rPr>
         <w:t>Introdução</w:t>
       </w:r>
-      <w:bookmarkEnd w:id="19"/>
+      <w:bookmarkEnd w:id="18"/>
     </w:p>
     <w:p>
       <w:pPr>
@@ -4627,7 +4643,79 @@
           <w:sz w:val="24"/>
           <w:szCs w:val="24"/>
         </w:rPr>
-        <w:t>Visando realizar esse teste, foram implementados 2 algoritmos de ordenação neste projeto, o Insertion Sort e o Quick Sort e com eles, o objetivo foi analisar o desempenho desses algoritmos em vários cenários, considerando o melhor, pior e médio caso.</w:t>
+        <w:t xml:space="preserve">Visando realizar esse teste, foram implementados 2 algoritmos de ordenação neste projeto, o </w:t>
+      </w:r>
+      <w:proofErr w:type="spellStart"/>
+      <w:r>
+        <w:rPr>
+          <w:rFonts w:ascii="Arial" w:hAnsi="Arial" w:cs="Arial"/>
+          <w:sz w:val="24"/>
+          <w:szCs w:val="24"/>
+        </w:rPr>
+        <w:t>Insertion</w:t>
+      </w:r>
+      <w:proofErr w:type="spellEnd"/>
+      <w:r>
+        <w:rPr>
+          <w:rFonts w:ascii="Arial" w:hAnsi="Arial" w:cs="Arial"/>
+          <w:sz w:val="24"/>
+          <w:szCs w:val="24"/>
+        </w:rPr>
+        <w:t xml:space="preserve"> </w:t>
+      </w:r>
+      <w:proofErr w:type="spellStart"/>
+      <w:r>
+        <w:rPr>
+          <w:rFonts w:ascii="Arial" w:hAnsi="Arial" w:cs="Arial"/>
+          <w:sz w:val="24"/>
+          <w:szCs w:val="24"/>
+        </w:rPr>
+        <w:t>Sort</w:t>
+      </w:r>
+      <w:proofErr w:type="spellEnd"/>
+      <w:r>
+        <w:rPr>
+          <w:rFonts w:ascii="Arial" w:hAnsi="Arial" w:cs="Arial"/>
+          <w:sz w:val="24"/>
+          <w:szCs w:val="24"/>
+        </w:rPr>
+        <w:t xml:space="preserve"> e o </w:t>
+      </w:r>
+      <w:proofErr w:type="spellStart"/>
+      <w:r>
+        <w:rPr>
+          <w:rFonts w:ascii="Arial" w:hAnsi="Arial" w:cs="Arial"/>
+          <w:sz w:val="24"/>
+          <w:szCs w:val="24"/>
+        </w:rPr>
+        <w:t>Quick</w:t>
+      </w:r>
+      <w:proofErr w:type="spellEnd"/>
+      <w:r>
+        <w:rPr>
+          <w:rFonts w:ascii="Arial" w:hAnsi="Arial" w:cs="Arial"/>
+          <w:sz w:val="24"/>
+          <w:szCs w:val="24"/>
+        </w:rPr>
+        <w:t xml:space="preserve"> </w:t>
+      </w:r>
+      <w:proofErr w:type="spellStart"/>
+      <w:r>
+        <w:rPr>
+          <w:rFonts w:ascii="Arial" w:hAnsi="Arial" w:cs="Arial"/>
+          <w:sz w:val="24"/>
+          <w:szCs w:val="24"/>
+        </w:rPr>
+        <w:t>Sort</w:t>
+      </w:r>
+      <w:proofErr w:type="spellEnd"/>
+      <w:r>
+        <w:rPr>
+          <w:rFonts w:ascii="Arial" w:hAnsi="Arial" w:cs="Arial"/>
+          <w:sz w:val="24"/>
+          <w:szCs w:val="24"/>
+        </w:rPr>
+        <w:t xml:space="preserve"> e com eles, o objetivo foi analisar o desempenho desses algoritmos em vários cenários, considerando o melhor, pior e médio caso.</w:t>
       </w:r>
     </w:p>
     <w:p>
@@ -4646,7 +4734,7 @@
           <w:szCs w:val="24"/>
         </w:rPr>
       </w:pPr>
-      <w:bookmarkStart w:id="20" w:name="_Toc225522033"/>
+      <w:bookmarkStart w:id="19" w:name="_Toc225587754"/>
       <w:r>
         <w:rPr>
           <w:rFonts w:ascii="Arial" w:hAnsi="Arial" w:cs="Arial"/>
@@ -4656,25 +4744,53 @@
         </w:rPr>
         <w:t>Fundamentação Teórica</w:t>
       </w:r>
-      <w:bookmarkEnd w:id="20"/>
-    </w:p>
-    <w:p>
-      <w:pPr>
-        <w:spacing w:line="360" w:lineRule="auto"/>
-        <w:jc w:val="both"/>
-        <w:rPr>
-          <w:rFonts w:ascii="Arial" w:hAnsi="Arial" w:cs="Arial"/>
-          <w:sz w:val="24"/>
-          <w:szCs w:val="24"/>
-        </w:rPr>
-      </w:pPr>
-      <w:r>
-        <w:rPr>
-          <w:rFonts w:ascii="Arial" w:hAnsi="Arial" w:cs="Arial"/>
-          <w:sz w:val="24"/>
-          <w:szCs w:val="24"/>
-        </w:rPr>
-        <w:t xml:space="preserve">Insertion Sort: funciona semelhante a organização de cartas em uma mão. Percorre a lista e insere ada elemento na posição correta em </w:t>
+      <w:bookmarkEnd w:id="19"/>
+    </w:p>
+    <w:p>
+      <w:pPr>
+        <w:spacing w:line="360" w:lineRule="auto"/>
+        <w:jc w:val="both"/>
+        <w:rPr>
+          <w:rFonts w:ascii="Arial" w:hAnsi="Arial" w:cs="Arial"/>
+          <w:sz w:val="24"/>
+          <w:szCs w:val="24"/>
+        </w:rPr>
+      </w:pPr>
+      <w:proofErr w:type="spellStart"/>
+      <w:r>
+        <w:rPr>
+          <w:rFonts w:ascii="Arial" w:hAnsi="Arial" w:cs="Arial"/>
+          <w:sz w:val="24"/>
+          <w:szCs w:val="24"/>
+        </w:rPr>
+        <w:t>Insertion</w:t>
+      </w:r>
+      <w:proofErr w:type="spellEnd"/>
+      <w:r>
+        <w:rPr>
+          <w:rFonts w:ascii="Arial" w:hAnsi="Arial" w:cs="Arial"/>
+          <w:sz w:val="24"/>
+          <w:szCs w:val="24"/>
+        </w:rPr>
+        <w:t xml:space="preserve"> </w:t>
+      </w:r>
+      <w:proofErr w:type="spellStart"/>
+      <w:r>
+        <w:rPr>
+          <w:rFonts w:ascii="Arial" w:hAnsi="Arial" w:cs="Arial"/>
+          <w:sz w:val="24"/>
+          <w:szCs w:val="24"/>
+        </w:rPr>
+        <w:t>Sort</w:t>
+      </w:r>
+      <w:proofErr w:type="spellEnd"/>
+      <w:r>
+        <w:rPr>
+          <w:rFonts w:ascii="Arial" w:hAnsi="Arial" w:cs="Arial"/>
+          <w:sz w:val="24"/>
+          <w:szCs w:val="24"/>
+        </w:rPr>
+        <w:t xml:space="preserve">: funciona semelhante a organização de cartas em uma mão. Percorre a lista e insere ada elemento na posição correta em </w:t>
       </w:r>
       <w:r>
         <w:rPr>
@@ -4711,13 +4827,41 @@
           <w:szCs w:val="24"/>
         </w:rPr>
       </w:pPr>
-      <w:r>
-        <w:rPr>
-          <w:rFonts w:ascii="Arial" w:hAnsi="Arial" w:cs="Arial"/>
-          <w:sz w:val="24"/>
-          <w:szCs w:val="24"/>
-        </w:rPr>
-        <w:t>Quick Sort: é o algoritmo mais eficiente na maioria dos casos, pois utiliza de uma estratégia de divisão e conquista, onde seleciona um elemento como pivô e particiona a lista em 2 subconjuntos, elementos maiores e menores q o pivô e aplica o processo recursivamente a cada subconjunto.</w:t>
+      <w:proofErr w:type="spellStart"/>
+      <w:r>
+        <w:rPr>
+          <w:rFonts w:ascii="Arial" w:hAnsi="Arial" w:cs="Arial"/>
+          <w:sz w:val="24"/>
+          <w:szCs w:val="24"/>
+        </w:rPr>
+        <w:t>Quick</w:t>
+      </w:r>
+      <w:proofErr w:type="spellEnd"/>
+      <w:r>
+        <w:rPr>
+          <w:rFonts w:ascii="Arial" w:hAnsi="Arial" w:cs="Arial"/>
+          <w:sz w:val="24"/>
+          <w:szCs w:val="24"/>
+        </w:rPr>
+        <w:t xml:space="preserve"> </w:t>
+      </w:r>
+      <w:proofErr w:type="spellStart"/>
+      <w:r>
+        <w:rPr>
+          <w:rFonts w:ascii="Arial" w:hAnsi="Arial" w:cs="Arial"/>
+          <w:sz w:val="24"/>
+          <w:szCs w:val="24"/>
+        </w:rPr>
+        <w:t>Sort</w:t>
+      </w:r>
+      <w:proofErr w:type="spellEnd"/>
+      <w:r>
+        <w:rPr>
+          <w:rFonts w:ascii="Arial" w:hAnsi="Arial" w:cs="Arial"/>
+          <w:sz w:val="24"/>
+          <w:szCs w:val="24"/>
+        </w:rPr>
+        <w:t>: é o algoritmo mais eficiente na maioria dos casos, pois utiliza de uma estratégia de divisão e conquista, onde seleciona um elemento como pivô e particiona a lista em 2 subconjuntos, elementos maiores e menores q o pivô e aplica o processo recursivamente a cada subconjunto.</w:t>
       </w:r>
     </w:p>
     <w:p>
@@ -4736,7 +4880,7 @@
           <w:szCs w:val="24"/>
         </w:rPr>
       </w:pPr>
-      <w:bookmarkStart w:id="21" w:name="_Toc225522034"/>
+      <w:bookmarkStart w:id="20" w:name="_Toc225587755"/>
       <w:r>
         <w:rPr>
           <w:rFonts w:ascii="Arial" w:hAnsi="Arial" w:cs="Arial"/>
@@ -4746,7 +4890,7 @@
         </w:rPr>
         <w:t>Análise Assintótica</w:t>
       </w:r>
-      <w:bookmarkEnd w:id="21"/>
+      <w:bookmarkEnd w:id="20"/>
     </w:p>
     <w:tbl>
       <w:tblPr>
@@ -4880,14 +5024,34 @@
                 <w:szCs w:val="24"/>
               </w:rPr>
             </w:pPr>
+            <w:proofErr w:type="spellStart"/>
             <w:r>
               <w:rPr>
                 <w:rFonts w:ascii="Arial" w:hAnsi="Arial" w:cs="Arial"/>
                 <w:sz w:val="24"/>
                 <w:szCs w:val="24"/>
               </w:rPr>
-              <w:t>Insertion Sort</w:t>
-            </w:r>
+              <w:t>Insertion</w:t>
+            </w:r>
+            <w:proofErr w:type="spellEnd"/>
+            <w:r>
+              <w:rPr>
+                <w:rFonts w:ascii="Arial" w:hAnsi="Arial" w:cs="Arial"/>
+                <w:sz w:val="24"/>
+                <w:szCs w:val="24"/>
+              </w:rPr>
+              <w:t xml:space="preserve"> </w:t>
+            </w:r>
+            <w:proofErr w:type="spellStart"/>
+            <w:r>
+              <w:rPr>
+                <w:rFonts w:ascii="Arial" w:hAnsi="Arial" w:cs="Arial"/>
+                <w:sz w:val="24"/>
+                <w:szCs w:val="24"/>
+              </w:rPr>
+              <w:t>Sort</w:t>
+            </w:r>
+            <w:proofErr w:type="spellEnd"/>
           </w:p>
         </w:tc>
         <w:tc>
@@ -4981,14 +5145,34 @@
                 <w:szCs w:val="24"/>
               </w:rPr>
             </w:pPr>
+            <w:proofErr w:type="spellStart"/>
             <w:r>
               <w:rPr>
                 <w:rFonts w:ascii="Arial" w:hAnsi="Arial" w:cs="Arial"/>
                 <w:sz w:val="24"/>
                 <w:szCs w:val="24"/>
               </w:rPr>
-              <w:t>Quick Sort</w:t>
-            </w:r>
+              <w:t>Quick</w:t>
+            </w:r>
+            <w:proofErr w:type="spellEnd"/>
+            <w:r>
+              <w:rPr>
+                <w:rFonts w:ascii="Arial" w:hAnsi="Arial" w:cs="Arial"/>
+                <w:sz w:val="24"/>
+                <w:szCs w:val="24"/>
+              </w:rPr>
+              <w:t xml:space="preserve"> </w:t>
+            </w:r>
+            <w:proofErr w:type="spellStart"/>
+            <w:r>
+              <w:rPr>
+                <w:rFonts w:ascii="Arial" w:hAnsi="Arial" w:cs="Arial"/>
+                <w:sz w:val="24"/>
+                <w:szCs w:val="24"/>
+              </w:rPr>
+              <w:t>Sort</w:t>
+            </w:r>
+            <w:proofErr w:type="spellEnd"/>
           </w:p>
         </w:tc>
         <w:tc>
@@ -5005,13 +5189,23 @@
                 <w:szCs w:val="24"/>
               </w:rPr>
             </w:pPr>
+            <w:proofErr w:type="gramStart"/>
             <w:r>
               <w:rPr>
                 <w:rFonts w:ascii="Arial" w:hAnsi="Arial" w:cs="Arial"/>
                 <w:sz w:val="24"/>
                 <w:szCs w:val="24"/>
               </w:rPr>
-              <w:t>O(n log n)</w:t>
+              <w:t>O(</w:t>
+            </w:r>
+            <w:proofErr w:type="gramEnd"/>
+            <w:r>
+              <w:rPr>
+                <w:rFonts w:ascii="Arial" w:hAnsi="Arial" w:cs="Arial"/>
+                <w:sz w:val="24"/>
+                <w:szCs w:val="24"/>
+              </w:rPr>
+              <w:t>n log n)</w:t>
             </w:r>
           </w:p>
         </w:tc>
@@ -5029,13 +5223,23 @@
                 <w:szCs w:val="24"/>
               </w:rPr>
             </w:pPr>
+            <w:proofErr w:type="gramStart"/>
             <w:r>
               <w:rPr>
                 <w:rFonts w:ascii="Arial" w:hAnsi="Arial" w:cs="Arial"/>
                 <w:sz w:val="24"/>
                 <w:szCs w:val="24"/>
               </w:rPr>
-              <w:t>O(n log n)</w:t>
+              <w:t>O(</w:t>
+            </w:r>
+            <w:proofErr w:type="gramEnd"/>
+            <w:r>
+              <w:rPr>
+                <w:rFonts w:ascii="Arial" w:hAnsi="Arial" w:cs="Arial"/>
+                <w:sz w:val="24"/>
+                <w:szCs w:val="24"/>
+              </w:rPr>
+              <w:t>n log n)</w:t>
             </w:r>
           </w:p>
         </w:tc>
@@ -5081,7 +5285,79 @@
           <w:sz w:val="24"/>
           <w:szCs w:val="24"/>
         </w:rPr>
-        <w:t>O Insertion Sort apresenta desempenho linear no melhor caso, quando os dados já estão ordenados. Já o Quick Sort possui desempenho médio mais eficiente, mas pode atingir complexidade quadrática em cenários desfavoráveis.</w:t>
+        <w:t xml:space="preserve">O </w:t>
+      </w:r>
+      <w:proofErr w:type="spellStart"/>
+      <w:r>
+        <w:rPr>
+          <w:rFonts w:ascii="Arial" w:hAnsi="Arial" w:cs="Arial"/>
+          <w:sz w:val="24"/>
+          <w:szCs w:val="24"/>
+        </w:rPr>
+        <w:t>Insertion</w:t>
+      </w:r>
+      <w:proofErr w:type="spellEnd"/>
+      <w:r>
+        <w:rPr>
+          <w:rFonts w:ascii="Arial" w:hAnsi="Arial" w:cs="Arial"/>
+          <w:sz w:val="24"/>
+          <w:szCs w:val="24"/>
+        </w:rPr>
+        <w:t xml:space="preserve"> </w:t>
+      </w:r>
+      <w:proofErr w:type="spellStart"/>
+      <w:r>
+        <w:rPr>
+          <w:rFonts w:ascii="Arial" w:hAnsi="Arial" w:cs="Arial"/>
+          <w:sz w:val="24"/>
+          <w:szCs w:val="24"/>
+        </w:rPr>
+        <w:t>Sort</w:t>
+      </w:r>
+      <w:proofErr w:type="spellEnd"/>
+      <w:r>
+        <w:rPr>
+          <w:rFonts w:ascii="Arial" w:hAnsi="Arial" w:cs="Arial"/>
+          <w:sz w:val="24"/>
+          <w:szCs w:val="24"/>
+        </w:rPr>
+        <w:t xml:space="preserve"> apresenta desempenho linear no melhor caso, quando os dados já estão ordenados. Já o </w:t>
+      </w:r>
+      <w:proofErr w:type="spellStart"/>
+      <w:r>
+        <w:rPr>
+          <w:rFonts w:ascii="Arial" w:hAnsi="Arial" w:cs="Arial"/>
+          <w:sz w:val="24"/>
+          <w:szCs w:val="24"/>
+        </w:rPr>
+        <w:t>Quick</w:t>
+      </w:r>
+      <w:proofErr w:type="spellEnd"/>
+      <w:r>
+        <w:rPr>
+          <w:rFonts w:ascii="Arial" w:hAnsi="Arial" w:cs="Arial"/>
+          <w:sz w:val="24"/>
+          <w:szCs w:val="24"/>
+        </w:rPr>
+        <w:t xml:space="preserve"> </w:t>
+      </w:r>
+      <w:proofErr w:type="spellStart"/>
+      <w:r>
+        <w:rPr>
+          <w:rFonts w:ascii="Arial" w:hAnsi="Arial" w:cs="Arial"/>
+          <w:sz w:val="24"/>
+          <w:szCs w:val="24"/>
+        </w:rPr>
+        <w:t>Sort</w:t>
+      </w:r>
+      <w:proofErr w:type="spellEnd"/>
+      <w:r>
+        <w:rPr>
+          <w:rFonts w:ascii="Arial" w:hAnsi="Arial" w:cs="Arial"/>
+          <w:sz w:val="24"/>
+          <w:szCs w:val="24"/>
+        </w:rPr>
+        <w:t xml:space="preserve"> possui desempenho médio mais eficiente, mas pode atingir complexidade quadrática em cenários desfavoráveis.</w:t>
       </w:r>
     </w:p>
     <w:p>
@@ -5100,7 +5376,7 @@
           <w:szCs w:val="24"/>
         </w:rPr>
       </w:pPr>
-      <w:bookmarkStart w:id="22" w:name="_Toc225522035"/>
+      <w:bookmarkStart w:id="21" w:name="_Toc225587756"/>
       <w:r>
         <w:rPr>
           <w:rFonts w:ascii="Arial" w:hAnsi="Arial" w:cs="Arial"/>
@@ -5110,7 +5386,7 @@
         </w:rPr>
         <w:t>Metodologia Experimental</w:t>
       </w:r>
-      <w:bookmarkEnd w:id="22"/>
+      <w:bookmarkEnd w:id="21"/>
     </w:p>
     <w:p>
       <w:pPr>
@@ -5145,7 +5421,81 @@
           <w:szCs w:val="24"/>
         </w:rPr>
         <w:lastRenderedPageBreak/>
-        <w:t>caso seria com a lista previamente ordenada, o médio com a lista aleatória e o por caso, com a lista de forma inversa, lista essa que foi ordenada de forma aleatória utilizando-se da biblioteca “random” e do “random.seed(42)”, que cria uma seed fixa e garante a reprodutibilidade dos experimentos. Já o tempo de execução de cada algoritmo foi calculado pela função perf_counter, da biblioteca padrão do Python.</w:t>
+        <w:t>caso seria com a lista previamente ordenada, o médio com a lista aleatória e o por caso, com a lista de forma inversa, lista essa que foi ordenada de forma aleatória utilizando-se da biblioteca “</w:t>
+      </w:r>
+      <w:proofErr w:type="spellStart"/>
+      <w:r>
+        <w:rPr>
+          <w:rFonts w:ascii="Arial" w:hAnsi="Arial" w:cs="Arial"/>
+          <w:sz w:val="24"/>
+          <w:szCs w:val="24"/>
+        </w:rPr>
+        <w:t>random</w:t>
+      </w:r>
+      <w:proofErr w:type="spellEnd"/>
+      <w:r>
+        <w:rPr>
+          <w:rFonts w:ascii="Arial" w:hAnsi="Arial" w:cs="Arial"/>
+          <w:sz w:val="24"/>
+          <w:szCs w:val="24"/>
+        </w:rPr>
+        <w:t>” e do “</w:t>
+      </w:r>
+      <w:proofErr w:type="spellStart"/>
+      <w:proofErr w:type="gramStart"/>
+      <w:r>
+        <w:rPr>
+          <w:rFonts w:ascii="Arial" w:hAnsi="Arial" w:cs="Arial"/>
+          <w:sz w:val="24"/>
+          <w:szCs w:val="24"/>
+        </w:rPr>
+        <w:t>random.seed</w:t>
+      </w:r>
+      <w:proofErr w:type="spellEnd"/>
+      <w:proofErr w:type="gramEnd"/>
+      <w:r>
+        <w:rPr>
+          <w:rFonts w:ascii="Arial" w:hAnsi="Arial" w:cs="Arial"/>
+          <w:sz w:val="24"/>
+          <w:szCs w:val="24"/>
+        </w:rPr>
+        <w:t xml:space="preserve">(42)”, que cria uma </w:t>
+      </w:r>
+      <w:proofErr w:type="spellStart"/>
+      <w:r>
+        <w:rPr>
+          <w:rFonts w:ascii="Arial" w:hAnsi="Arial" w:cs="Arial"/>
+          <w:sz w:val="24"/>
+          <w:szCs w:val="24"/>
+        </w:rPr>
+        <w:t>seed</w:t>
+      </w:r>
+      <w:proofErr w:type="spellEnd"/>
+      <w:r>
+        <w:rPr>
+          <w:rFonts w:ascii="Arial" w:hAnsi="Arial" w:cs="Arial"/>
+          <w:sz w:val="24"/>
+          <w:szCs w:val="24"/>
+        </w:rPr>
+        <w:t xml:space="preserve"> fixa e garante a reprodutibilidade dos experimentos. Já o tempo de execução de cada algoritmo foi calculado pela função </w:t>
+      </w:r>
+      <w:proofErr w:type="spellStart"/>
+      <w:r>
+        <w:rPr>
+          <w:rFonts w:ascii="Arial" w:hAnsi="Arial" w:cs="Arial"/>
+          <w:sz w:val="24"/>
+          <w:szCs w:val="24"/>
+        </w:rPr>
+        <w:t>perf_counter</w:t>
+      </w:r>
+      <w:proofErr w:type="spellEnd"/>
+      <w:r>
+        <w:rPr>
+          <w:rFonts w:ascii="Arial" w:hAnsi="Arial" w:cs="Arial"/>
+          <w:sz w:val="24"/>
+          <w:szCs w:val="24"/>
+        </w:rPr>
+        <w:t>, da biblioteca padrão do Python.</w:t>
       </w:r>
     </w:p>
     <w:p>
@@ -5164,7 +5514,7 @@
           <w:szCs w:val="24"/>
         </w:rPr>
       </w:pPr>
-      <w:bookmarkStart w:id="23" w:name="_Toc225522036"/>
+      <w:bookmarkStart w:id="22" w:name="_Toc225587757"/>
       <w:r>
         <w:rPr>
           <w:rFonts w:ascii="Arial" w:hAnsi="Arial" w:cs="Arial"/>
@@ -5174,25 +5524,133 @@
         </w:rPr>
         <w:t>Resultados</w:t>
       </w:r>
-      <w:bookmarkEnd w:id="23"/>
-    </w:p>
-    <w:p>
-      <w:pPr>
-        <w:spacing w:line="360" w:lineRule="auto"/>
-        <w:jc w:val="both"/>
-        <w:rPr>
-          <w:rFonts w:ascii="Arial" w:hAnsi="Arial" w:cs="Arial"/>
-          <w:sz w:val="24"/>
-          <w:szCs w:val="24"/>
-        </w:rPr>
-      </w:pPr>
-      <w:r>
-        <w:rPr>
-          <w:rFonts w:ascii="Arial" w:hAnsi="Arial" w:cs="Arial"/>
-          <w:sz w:val="24"/>
-          <w:szCs w:val="24"/>
-        </w:rPr>
-        <w:t>O Insertion Sort apresentou um desempenho satisfatório apenas nas entradas pequenas ou que já estavam ordenadas, enquanto o Quick Sort demonstrou um melhor desempenho na maioria dos casos, tendo também um tempo de execução que cresce de forma menos gradativa comparado ao do Insertion Sort, que aumenta de maneira significativa à medida em que o tamanho de entrada aumenta.</w:t>
+      <w:bookmarkEnd w:id="22"/>
+    </w:p>
+    <w:p>
+      <w:pPr>
+        <w:spacing w:line="360" w:lineRule="auto"/>
+        <w:jc w:val="both"/>
+        <w:rPr>
+          <w:rFonts w:ascii="Arial" w:hAnsi="Arial" w:cs="Arial"/>
+          <w:sz w:val="24"/>
+          <w:szCs w:val="24"/>
+        </w:rPr>
+      </w:pPr>
+      <w:r>
+        <w:rPr>
+          <w:rFonts w:ascii="Arial" w:hAnsi="Arial" w:cs="Arial"/>
+          <w:sz w:val="24"/>
+          <w:szCs w:val="24"/>
+        </w:rPr>
+        <w:t xml:space="preserve">O </w:t>
+      </w:r>
+      <w:proofErr w:type="spellStart"/>
+      <w:r>
+        <w:rPr>
+          <w:rFonts w:ascii="Arial" w:hAnsi="Arial" w:cs="Arial"/>
+          <w:sz w:val="24"/>
+          <w:szCs w:val="24"/>
+        </w:rPr>
+        <w:t>Insertion</w:t>
+      </w:r>
+      <w:proofErr w:type="spellEnd"/>
+      <w:r>
+        <w:rPr>
+          <w:rFonts w:ascii="Arial" w:hAnsi="Arial" w:cs="Arial"/>
+          <w:sz w:val="24"/>
+          <w:szCs w:val="24"/>
+        </w:rPr>
+        <w:t xml:space="preserve"> </w:t>
+      </w:r>
+      <w:proofErr w:type="spellStart"/>
+      <w:r>
+        <w:rPr>
+          <w:rFonts w:ascii="Arial" w:hAnsi="Arial" w:cs="Arial"/>
+          <w:sz w:val="24"/>
+          <w:szCs w:val="24"/>
+        </w:rPr>
+        <w:t>Sort</w:t>
+      </w:r>
+      <w:proofErr w:type="spellEnd"/>
+      <w:r>
+        <w:rPr>
+          <w:rFonts w:ascii="Arial" w:hAnsi="Arial" w:cs="Arial"/>
+          <w:sz w:val="24"/>
+          <w:szCs w:val="24"/>
+        </w:rPr>
+        <w:t xml:space="preserve"> apresentou um desempenho satisfatório apenas nas entradas pequenas ou que já estavam ordenadas, enquanto o </w:t>
+      </w:r>
+      <w:proofErr w:type="spellStart"/>
+      <w:r>
+        <w:rPr>
+          <w:rFonts w:ascii="Arial" w:hAnsi="Arial" w:cs="Arial"/>
+          <w:sz w:val="24"/>
+          <w:szCs w:val="24"/>
+        </w:rPr>
+        <w:t>Quick</w:t>
+      </w:r>
+      <w:proofErr w:type="spellEnd"/>
+      <w:r>
+        <w:rPr>
+          <w:rFonts w:ascii="Arial" w:hAnsi="Arial" w:cs="Arial"/>
+          <w:sz w:val="24"/>
+          <w:szCs w:val="24"/>
+        </w:rPr>
+        <w:t xml:space="preserve"> </w:t>
+      </w:r>
+      <w:proofErr w:type="spellStart"/>
+      <w:r>
+        <w:rPr>
+          <w:rFonts w:ascii="Arial" w:hAnsi="Arial" w:cs="Arial"/>
+          <w:sz w:val="24"/>
+          <w:szCs w:val="24"/>
+        </w:rPr>
+        <w:t>Sort</w:t>
+      </w:r>
+      <w:proofErr w:type="spellEnd"/>
+      <w:r>
+        <w:rPr>
+          <w:rFonts w:ascii="Arial" w:hAnsi="Arial" w:cs="Arial"/>
+          <w:sz w:val="24"/>
+          <w:szCs w:val="24"/>
+        </w:rPr>
+        <w:t xml:space="preserve"> demonstrou um melhor desempenho na maioria dos casos, tendo também um tempo de execução que cresce de forma menos gradativa comparado ao do </w:t>
+      </w:r>
+      <w:proofErr w:type="spellStart"/>
+      <w:r>
+        <w:rPr>
+          <w:rFonts w:ascii="Arial" w:hAnsi="Arial" w:cs="Arial"/>
+          <w:sz w:val="24"/>
+          <w:szCs w:val="24"/>
+        </w:rPr>
+        <w:t>Insertion</w:t>
+      </w:r>
+      <w:proofErr w:type="spellEnd"/>
+      <w:r>
+        <w:rPr>
+          <w:rFonts w:ascii="Arial" w:hAnsi="Arial" w:cs="Arial"/>
+          <w:sz w:val="24"/>
+          <w:szCs w:val="24"/>
+        </w:rPr>
+        <w:t xml:space="preserve"> </w:t>
+      </w:r>
+      <w:proofErr w:type="spellStart"/>
+      <w:r>
+        <w:rPr>
+          <w:rFonts w:ascii="Arial" w:hAnsi="Arial" w:cs="Arial"/>
+          <w:sz w:val="24"/>
+          <w:szCs w:val="24"/>
+        </w:rPr>
+        <w:t>Sort</w:t>
+      </w:r>
+      <w:proofErr w:type="spellEnd"/>
+      <w:r>
+        <w:rPr>
+          <w:rFonts w:ascii="Arial" w:hAnsi="Arial" w:cs="Arial"/>
+          <w:sz w:val="24"/>
+          <w:szCs w:val="24"/>
+        </w:rPr>
+        <w:t>, que aumenta de maneira significativa à medida em que o tamanho de entrada aumenta.</w:t>
       </w:r>
     </w:p>
     <w:p>
@@ -5211,7 +5669,7 @@
           <w:szCs w:val="24"/>
         </w:rPr>
       </w:pPr>
-      <w:bookmarkStart w:id="24" w:name="_Toc225522037"/>
+      <w:bookmarkStart w:id="23" w:name="_Toc225587758"/>
       <w:r>
         <w:rPr>
           <w:rFonts w:ascii="Arial" w:hAnsi="Arial" w:cs="Arial"/>
@@ -5221,24 +5679,97 @@
         </w:rPr>
         <w:t>Discussão</w:t>
       </w:r>
-      <w:bookmarkEnd w:id="24"/>
-    </w:p>
-    <w:p>
-      <w:pPr>
-        <w:jc w:val="both"/>
-        <w:rPr>
-          <w:rFonts w:ascii="Arial" w:hAnsi="Arial" w:cs="Arial"/>
-          <w:sz w:val="24"/>
-          <w:szCs w:val="24"/>
-        </w:rPr>
-      </w:pPr>
-      <w:r>
-        <w:rPr>
-          <w:rFonts w:ascii="Arial" w:hAnsi="Arial" w:cs="Arial"/>
-          <w:sz w:val="24"/>
-          <w:szCs w:val="24"/>
-        </w:rPr>
-        <w:t>aa</w:t>
+      <w:bookmarkEnd w:id="23"/>
+    </w:p>
+    <w:p>
+      <w:pPr>
+        <w:spacing w:line="360" w:lineRule="auto"/>
+        <w:jc w:val="both"/>
+        <w:rPr>
+          <w:rFonts w:ascii="Arial" w:hAnsi="Arial" w:cs="Arial"/>
+          <w:sz w:val="24"/>
+          <w:szCs w:val="24"/>
+        </w:rPr>
+      </w:pPr>
+      <w:r>
+        <w:rPr>
+          <w:rFonts w:ascii="Arial" w:hAnsi="Arial" w:cs="Arial"/>
+          <w:sz w:val="24"/>
+          <w:szCs w:val="24"/>
+        </w:rPr>
+        <w:t xml:space="preserve">Com base nos resultados, confirmaram-se as previsões teóricas dos algoritmos estudados, o </w:t>
+      </w:r>
+      <w:proofErr w:type="spellStart"/>
+      <w:r>
+        <w:rPr>
+          <w:rFonts w:ascii="Arial" w:hAnsi="Arial" w:cs="Arial"/>
+          <w:sz w:val="24"/>
+          <w:szCs w:val="24"/>
+        </w:rPr>
+        <w:t>Insertion</w:t>
+      </w:r>
+      <w:proofErr w:type="spellEnd"/>
+      <w:r>
+        <w:rPr>
+          <w:rFonts w:ascii="Arial" w:hAnsi="Arial" w:cs="Arial"/>
+          <w:sz w:val="24"/>
+          <w:szCs w:val="24"/>
+        </w:rPr>
+        <w:t xml:space="preserve"> </w:t>
+      </w:r>
+      <w:proofErr w:type="spellStart"/>
+      <w:r>
+        <w:rPr>
+          <w:rFonts w:ascii="Arial" w:hAnsi="Arial" w:cs="Arial"/>
+          <w:sz w:val="24"/>
+          <w:szCs w:val="24"/>
+        </w:rPr>
+        <w:t>Sort</w:t>
+      </w:r>
+      <w:proofErr w:type="spellEnd"/>
+      <w:r>
+        <w:rPr>
+          <w:rFonts w:ascii="Arial" w:hAnsi="Arial" w:cs="Arial"/>
+          <w:sz w:val="24"/>
+          <w:szCs w:val="24"/>
+        </w:rPr>
+        <w:t xml:space="preserve"> se demonstrou eficiente no melhor caso, mas apresentou uma baixa escalabilidade em cenários mais complexos. Já o </w:t>
+      </w:r>
+      <w:proofErr w:type="spellStart"/>
+      <w:r>
+        <w:rPr>
+          <w:rFonts w:ascii="Arial" w:hAnsi="Arial" w:cs="Arial"/>
+          <w:sz w:val="24"/>
+          <w:szCs w:val="24"/>
+        </w:rPr>
+        <w:t>Quick</w:t>
+      </w:r>
+      <w:proofErr w:type="spellEnd"/>
+      <w:r>
+        <w:rPr>
+          <w:rFonts w:ascii="Arial" w:hAnsi="Arial" w:cs="Arial"/>
+          <w:sz w:val="24"/>
+          <w:szCs w:val="24"/>
+        </w:rPr>
+        <w:t xml:space="preserve"> </w:t>
+      </w:r>
+      <w:proofErr w:type="spellStart"/>
+      <w:r>
+        <w:rPr>
+          <w:rFonts w:ascii="Arial" w:hAnsi="Arial" w:cs="Arial"/>
+          <w:sz w:val="24"/>
+          <w:szCs w:val="24"/>
+        </w:rPr>
+        <w:t>Sort</w:t>
+      </w:r>
+      <w:proofErr w:type="spellEnd"/>
+      <w:r>
+        <w:rPr>
+          <w:rFonts w:ascii="Arial" w:hAnsi="Arial" w:cs="Arial"/>
+          <w:sz w:val="24"/>
+          <w:szCs w:val="24"/>
+        </w:rPr>
+        <w:t>, demonstrou melhor desempenho geral, mas também mostrou que a escolha inadequada do pivô pode levar à degradação do desempenho e até mesmo estourar o limite de recursão do Python. Devido a essa degradação, foi necessário ajustar a escolha do pivô durante os testes, que nem passavam de 800 casos devido a recursão excessiva.</w:t>
       </w:r>
     </w:p>
     <w:p>
@@ -5257,7 +5788,7 @@
           <w:szCs w:val="24"/>
         </w:rPr>
       </w:pPr>
-      <w:bookmarkStart w:id="25" w:name="_Toc225522038"/>
+      <w:bookmarkStart w:id="24" w:name="_Toc225587759"/>
       <w:r>
         <w:rPr>
           <w:rFonts w:ascii="Arial" w:hAnsi="Arial" w:cs="Arial"/>
@@ -5267,190 +5798,161 @@
         </w:rPr>
         <w:t>Conclusão</w:t>
       </w:r>
-      <w:bookmarkEnd w:id="25"/>
-    </w:p>
-    <w:p>
-      <w:pPr>
-        <w:jc w:val="both"/>
-        <w:rPr>
-          <w:rFonts w:ascii="Arial" w:hAnsi="Arial" w:cs="Arial"/>
-          <w:sz w:val="24"/>
-          <w:szCs w:val="24"/>
-        </w:rPr>
-      </w:pPr>
-      <w:r>
-        <w:rPr>
-          <w:rFonts w:ascii="Arial" w:hAnsi="Arial" w:cs="Arial"/>
-          <w:sz w:val="24"/>
-          <w:szCs w:val="24"/>
-        </w:rPr>
-        <w:t>aa</w:t>
-      </w:r>
-    </w:p>
-    <w:p>
-      <w:pPr>
-        <w:spacing w:line="360" w:lineRule="auto"/>
-        <w:jc w:val="both"/>
-        <w:rPr>
-          <w:rFonts w:ascii="Arial" w:hAnsi="Arial" w:cs="Arial"/>
-          <w:sz w:val="24"/>
-          <w:szCs w:val="24"/>
-        </w:rPr>
-      </w:pPr>
-    </w:p>
-    <w:p>
-      <w:pPr>
-        <w:spacing w:line="360" w:lineRule="auto"/>
-        <w:jc w:val="both"/>
-        <w:rPr>
-          <w:rFonts w:ascii="Arial" w:hAnsi="Arial" w:cs="Arial"/>
-          <w:sz w:val="24"/>
-          <w:szCs w:val="24"/>
-        </w:rPr>
-      </w:pPr>
-    </w:p>
-    <w:p>
-      <w:pPr>
-        <w:spacing w:line="360" w:lineRule="auto"/>
-        <w:jc w:val="both"/>
-        <w:rPr>
-          <w:rFonts w:ascii="Arial" w:hAnsi="Arial" w:cs="Arial"/>
-          <w:sz w:val="24"/>
-          <w:szCs w:val="24"/>
-        </w:rPr>
-      </w:pPr>
-    </w:p>
-    <w:p>
-      <w:pPr>
-        <w:spacing w:line="360" w:lineRule="auto"/>
-        <w:jc w:val="both"/>
-        <w:rPr>
-          <w:rFonts w:ascii="Arial" w:hAnsi="Arial" w:cs="Arial"/>
-          <w:sz w:val="24"/>
-          <w:szCs w:val="24"/>
-        </w:rPr>
-      </w:pPr>
-    </w:p>
-    <w:p>
-      <w:pPr>
-        <w:spacing w:line="360" w:lineRule="auto"/>
-        <w:jc w:val="both"/>
-        <w:rPr>
-          <w:rFonts w:ascii="Arial" w:hAnsi="Arial" w:cs="Arial"/>
-          <w:sz w:val="24"/>
-          <w:szCs w:val="24"/>
-        </w:rPr>
-      </w:pPr>
-    </w:p>
-    <w:p>
-      <w:pPr>
-        <w:spacing w:line="360" w:lineRule="auto"/>
-        <w:jc w:val="both"/>
-        <w:rPr>
-          <w:rFonts w:ascii="Arial" w:hAnsi="Arial" w:cs="Arial"/>
-          <w:sz w:val="24"/>
-          <w:szCs w:val="24"/>
-        </w:rPr>
-      </w:pPr>
-    </w:p>
-    <w:p>
-      <w:pPr>
-        <w:spacing w:line="360" w:lineRule="auto"/>
-        <w:jc w:val="both"/>
-        <w:rPr>
-          <w:rFonts w:ascii="Arial" w:hAnsi="Arial" w:cs="Arial"/>
-          <w:sz w:val="24"/>
-          <w:szCs w:val="24"/>
-        </w:rPr>
-      </w:pPr>
-    </w:p>
-    <w:p>
-      <w:pPr>
-        <w:spacing w:line="360" w:lineRule="auto"/>
-        <w:jc w:val="both"/>
-        <w:rPr>
-          <w:rFonts w:ascii="Arial" w:hAnsi="Arial" w:cs="Arial"/>
-          <w:sz w:val="24"/>
-          <w:szCs w:val="24"/>
-        </w:rPr>
-      </w:pPr>
-    </w:p>
-    <w:p>
-      <w:pPr>
-        <w:spacing w:line="360" w:lineRule="auto"/>
-        <w:jc w:val="both"/>
-        <w:rPr>
-          <w:rFonts w:ascii="Arial" w:hAnsi="Arial" w:cs="Arial"/>
-          <w:sz w:val="24"/>
-          <w:szCs w:val="24"/>
-        </w:rPr>
-      </w:pPr>
-    </w:p>
-    <w:p>
-      <w:pPr>
-        <w:spacing w:line="360" w:lineRule="auto"/>
-        <w:jc w:val="both"/>
-        <w:rPr>
-          <w:rFonts w:ascii="Arial" w:hAnsi="Arial" w:cs="Arial"/>
-          <w:sz w:val="24"/>
-          <w:szCs w:val="24"/>
-        </w:rPr>
-      </w:pPr>
-    </w:p>
-    <w:p>
-      <w:pPr>
-        <w:spacing w:line="360" w:lineRule="auto"/>
-        <w:jc w:val="both"/>
-        <w:rPr>
-          <w:rFonts w:ascii="Arial" w:hAnsi="Arial" w:cs="Arial"/>
-          <w:sz w:val="24"/>
-          <w:szCs w:val="24"/>
-        </w:rPr>
-      </w:pPr>
-    </w:p>
-    <w:p>
-      <w:pPr>
-        <w:spacing w:line="360" w:lineRule="auto"/>
-        <w:jc w:val="both"/>
-        <w:rPr>
-          <w:rFonts w:ascii="Arial" w:hAnsi="Arial" w:cs="Arial"/>
-          <w:sz w:val="24"/>
-          <w:szCs w:val="24"/>
-        </w:rPr>
-      </w:pPr>
-    </w:p>
-    <w:p>
-      <w:pPr>
-        <w:spacing w:line="360" w:lineRule="auto"/>
-        <w:jc w:val="both"/>
-        <w:rPr>
-          <w:rFonts w:ascii="Arial" w:hAnsi="Arial" w:cs="Arial"/>
-          <w:sz w:val="24"/>
-          <w:szCs w:val="24"/>
-        </w:rPr>
-      </w:pPr>
-    </w:p>
-    <w:p>
-      <w:pPr>
-        <w:spacing w:line="360" w:lineRule="auto"/>
-        <w:jc w:val="both"/>
-        <w:rPr>
-          <w:rFonts w:ascii="Arial" w:hAnsi="Arial" w:cs="Arial"/>
-          <w:sz w:val="24"/>
-          <w:szCs w:val="24"/>
-        </w:rPr>
-      </w:pPr>
-    </w:p>
-    <w:p>
-      <w:pPr>
-        <w:spacing w:line="360" w:lineRule="auto"/>
-        <w:jc w:val="both"/>
-        <w:rPr>
-          <w:rFonts w:ascii="Arial" w:hAnsi="Arial" w:cs="Arial"/>
-          <w:sz w:val="24"/>
-          <w:szCs w:val="24"/>
-        </w:rPr>
-      </w:pPr>
+      <w:bookmarkEnd w:id="24"/>
+    </w:p>
+    <w:p>
+      <w:pPr>
+        <w:spacing w:line="360" w:lineRule="auto"/>
+        <w:jc w:val="both"/>
+        <w:rPr>
+          <w:rFonts w:ascii="Arial" w:hAnsi="Arial" w:cs="Arial"/>
+          <w:sz w:val="24"/>
+          <w:szCs w:val="24"/>
+        </w:rPr>
+      </w:pPr>
+      <w:r>
+        <w:rPr>
+          <w:rFonts w:ascii="Arial" w:hAnsi="Arial" w:cs="Arial"/>
+          <w:sz w:val="24"/>
+          <w:szCs w:val="24"/>
+        </w:rPr>
+        <w:t xml:space="preserve">Com esse projeto, foi possível compreender o funcionamento e o desempenho de cada um dos algoritmos de ordenação, observando-se que algoritmos simples, como o </w:t>
+      </w:r>
+      <w:proofErr w:type="spellStart"/>
+      <w:r>
+        <w:rPr>
+          <w:rFonts w:ascii="Arial" w:hAnsi="Arial" w:cs="Arial"/>
+          <w:sz w:val="24"/>
+          <w:szCs w:val="24"/>
+        </w:rPr>
+        <w:t>Insertion</w:t>
+      </w:r>
+      <w:proofErr w:type="spellEnd"/>
+      <w:r>
+        <w:rPr>
+          <w:rFonts w:ascii="Arial" w:hAnsi="Arial" w:cs="Arial"/>
+          <w:sz w:val="24"/>
+          <w:szCs w:val="24"/>
+        </w:rPr>
+        <w:t xml:space="preserve"> </w:t>
+      </w:r>
+      <w:proofErr w:type="spellStart"/>
+      <w:r>
+        <w:rPr>
+          <w:rFonts w:ascii="Arial" w:hAnsi="Arial" w:cs="Arial"/>
+          <w:sz w:val="24"/>
+          <w:szCs w:val="24"/>
+        </w:rPr>
+        <w:t>Sort</w:t>
+      </w:r>
+      <w:proofErr w:type="spellEnd"/>
+      <w:r>
+        <w:rPr>
+          <w:rFonts w:ascii="Arial" w:hAnsi="Arial" w:cs="Arial"/>
+          <w:sz w:val="24"/>
+          <w:szCs w:val="24"/>
+        </w:rPr>
+        <w:t xml:space="preserve">, podem ser eficientes em casos específicos, mas em casos maiores e mais complexos, perde muita eficiência, enquanto o contrário ocorre com o </w:t>
+      </w:r>
+      <w:proofErr w:type="spellStart"/>
+      <w:r>
+        <w:rPr>
+          <w:rFonts w:ascii="Arial" w:hAnsi="Arial" w:cs="Arial"/>
+          <w:sz w:val="24"/>
+          <w:szCs w:val="24"/>
+        </w:rPr>
+        <w:t>Quick</w:t>
+      </w:r>
+      <w:proofErr w:type="spellEnd"/>
+      <w:r>
+        <w:rPr>
+          <w:rFonts w:ascii="Arial" w:hAnsi="Arial" w:cs="Arial"/>
+          <w:sz w:val="24"/>
+          <w:szCs w:val="24"/>
+        </w:rPr>
+        <w:t xml:space="preserve"> </w:t>
+      </w:r>
+      <w:proofErr w:type="spellStart"/>
+      <w:r>
+        <w:rPr>
+          <w:rFonts w:ascii="Arial" w:hAnsi="Arial" w:cs="Arial"/>
+          <w:sz w:val="24"/>
+          <w:szCs w:val="24"/>
+        </w:rPr>
+        <w:t>Sort</w:t>
+      </w:r>
+      <w:proofErr w:type="spellEnd"/>
+      <w:r>
+        <w:rPr>
+          <w:rFonts w:ascii="Arial" w:hAnsi="Arial" w:cs="Arial"/>
+          <w:sz w:val="24"/>
+          <w:szCs w:val="24"/>
+        </w:rPr>
+        <w:t>, que tem um desempenho geral melhor devida a sua maior complexidade.</w:t>
+      </w:r>
+    </w:p>
+    <w:p>
+      <w:pPr>
+        <w:spacing w:line="360" w:lineRule="auto"/>
+        <w:jc w:val="both"/>
+        <w:rPr>
+          <w:rFonts w:ascii="Arial" w:hAnsi="Arial" w:cs="Arial"/>
+          <w:sz w:val="24"/>
+          <w:szCs w:val="24"/>
+        </w:rPr>
+      </w:pPr>
+      <w:r>
+        <w:rPr>
+          <w:rFonts w:ascii="Arial" w:hAnsi="Arial" w:cs="Arial"/>
+          <w:sz w:val="24"/>
+          <w:szCs w:val="24"/>
+        </w:rPr>
+        <w:t>Além disso, foi possível perceber como a escolha do algoritmo impacta na performance geral do sistema, demonstrando a importância da escolha correta</w:t>
+      </w:r>
+      <w:r>
+        <w:rPr>
+          <w:rFonts w:ascii="Arial" w:hAnsi="Arial" w:cs="Arial"/>
+          <w:sz w:val="24"/>
+          <w:szCs w:val="24"/>
+        </w:rPr>
+        <w:t xml:space="preserve">, e, no caso do </w:t>
+      </w:r>
+      <w:proofErr w:type="spellStart"/>
+      <w:r>
+        <w:rPr>
+          <w:rFonts w:ascii="Arial" w:hAnsi="Arial" w:cs="Arial"/>
+          <w:sz w:val="24"/>
+          <w:szCs w:val="24"/>
+        </w:rPr>
+        <w:t>Quick</w:t>
+      </w:r>
+      <w:proofErr w:type="spellEnd"/>
+      <w:r>
+        <w:rPr>
+          <w:rFonts w:ascii="Arial" w:hAnsi="Arial" w:cs="Arial"/>
+          <w:sz w:val="24"/>
+          <w:szCs w:val="24"/>
+        </w:rPr>
+        <w:t xml:space="preserve"> </w:t>
+      </w:r>
+      <w:proofErr w:type="spellStart"/>
+      <w:r>
+        <w:rPr>
+          <w:rFonts w:ascii="Arial" w:hAnsi="Arial" w:cs="Arial"/>
+          <w:sz w:val="24"/>
+          <w:szCs w:val="24"/>
+        </w:rPr>
+        <w:t>Sort</w:t>
+      </w:r>
+      <w:proofErr w:type="spellEnd"/>
+      <w:r>
+        <w:rPr>
+          <w:rFonts w:ascii="Arial" w:hAnsi="Arial" w:cs="Arial"/>
+          <w:sz w:val="24"/>
+          <w:szCs w:val="24"/>
+        </w:rPr>
+        <w:t>, da estratégia adequada de implementação, como a seleção do pivô, que pode impactar diretamente no desempenho geral do sistema.</w:t>
+      </w:r>
     </w:p>
     <w:p>
       <w:pPr>
@@ -5481,7 +5983,7 @@
           <w:szCs w:val="24"/>
         </w:rPr>
       </w:pPr>
-      <w:bookmarkStart w:id="26" w:name="_Toc225522039"/>
+      <w:bookmarkStart w:id="25" w:name="_Toc225587760"/>
       <w:r>
         <w:rPr>
           <w:rFonts w:ascii="Arial" w:hAnsi="Arial" w:cs="Arial"/>
@@ -5491,20 +5993,211 @@
           <w:sz w:val="24"/>
           <w:szCs w:val="24"/>
         </w:rPr>
+        <w:lastRenderedPageBreak/>
         <w:t>Conclusão Geral</w:t>
       </w:r>
-      <w:bookmarkEnd w:id="26"/>
-    </w:p>
-    <w:p>
-      <w:pPr>
-        <w:spacing w:line="360" w:lineRule="auto"/>
-        <w:jc w:val="both"/>
-        <w:rPr>
-          <w:rFonts w:ascii="Arial" w:hAnsi="Arial" w:cs="Arial"/>
-          <w:sz w:val="24"/>
-          <w:szCs w:val="24"/>
-        </w:rPr>
-      </w:pPr>
+      <w:bookmarkEnd w:id="25"/>
+    </w:p>
+    <w:p>
+      <w:pPr>
+        <w:spacing w:line="360" w:lineRule="auto"/>
+        <w:jc w:val="both"/>
+        <w:rPr>
+          <w:rFonts w:ascii="Arial" w:hAnsi="Arial" w:cs="Arial"/>
+          <w:sz w:val="24"/>
+          <w:szCs w:val="24"/>
+        </w:rPr>
+      </w:pPr>
+      <w:r>
+        <w:rPr>
+          <w:rFonts w:ascii="Arial" w:hAnsi="Arial" w:cs="Arial"/>
+          <w:sz w:val="24"/>
+          <w:szCs w:val="24"/>
+        </w:rPr>
+        <w:t xml:space="preserve">A realização destes 3 projetos nos uma compreensão prática dos principais conceitos abordados na disciplina de Estruturas de Dados, demonstrando a importância da escolha adequada de estruturas e algoritmos para a resolução eficiente </w:t>
+      </w:r>
+      <w:proofErr w:type="spellStart"/>
+      <w:r>
+        <w:rPr>
+          <w:rFonts w:ascii="Arial" w:hAnsi="Arial" w:cs="Arial"/>
+          <w:sz w:val="24"/>
+          <w:szCs w:val="24"/>
+        </w:rPr>
+        <w:t>dfos</w:t>
+      </w:r>
+      <w:proofErr w:type="spellEnd"/>
+      <w:r>
+        <w:rPr>
+          <w:rFonts w:ascii="Arial" w:hAnsi="Arial" w:cs="Arial"/>
+          <w:sz w:val="24"/>
+          <w:szCs w:val="24"/>
+        </w:rPr>
+        <w:t xml:space="preserve"> problemas computacionais.</w:t>
+      </w:r>
+    </w:p>
+    <w:p>
+      <w:pPr>
+        <w:spacing w:line="360" w:lineRule="auto"/>
+        <w:jc w:val="both"/>
+        <w:rPr>
+          <w:rFonts w:ascii="Arial" w:hAnsi="Arial" w:cs="Arial"/>
+          <w:sz w:val="24"/>
+          <w:szCs w:val="24"/>
+        </w:rPr>
+      </w:pPr>
+      <w:r>
+        <w:rPr>
+          <w:rFonts w:ascii="Arial" w:hAnsi="Arial" w:cs="Arial"/>
+          <w:sz w:val="24"/>
+          <w:szCs w:val="24"/>
+        </w:rPr>
+        <w:t xml:space="preserve">No projeto I, </w:t>
+      </w:r>
+      <w:r>
+        <w:rPr>
+          <w:rFonts w:ascii="Arial" w:hAnsi="Arial" w:cs="Arial"/>
+          <w:sz w:val="24"/>
+          <w:szCs w:val="24"/>
+        </w:rPr>
+        <w:t>foi possível observar o impacto do balanceamento em estruturas arbóreas. As árvores AVL e Rubro-Negra demonstraram uma maior estabilidade e eficiência comparadas a Árvore Binária, garantindo operações eficientes independentemente da ordem da inserção dos dados.</w:t>
+      </w:r>
+    </w:p>
+    <w:p>
+      <w:pPr>
+        <w:spacing w:line="360" w:lineRule="auto"/>
+        <w:jc w:val="both"/>
+        <w:rPr>
+          <w:rFonts w:ascii="Arial" w:hAnsi="Arial" w:cs="Arial"/>
+          <w:sz w:val="24"/>
+          <w:szCs w:val="24"/>
+        </w:rPr>
+      </w:pPr>
+      <w:r>
+        <w:rPr>
+          <w:rFonts w:ascii="Arial" w:hAnsi="Arial" w:cs="Arial"/>
+          <w:sz w:val="24"/>
+          <w:szCs w:val="24"/>
+        </w:rPr>
+        <w:t>No projeto II, a análise dos algoritmos de busca evidenciou diferenças significativas de desempenho entre as abordagens, pois a busca binária apresentou um excelente desempenho se aplicada a dados previamente ordenados, enquanto a busca sequencial mostrou-se simples, porém ineficiente em grandes volumes de dados, enquanto a busca em árvore destacou a dependência do balanceamento da estrutura, visando manter eficiência.</w:t>
+      </w:r>
+    </w:p>
+    <w:p>
+      <w:pPr>
+        <w:spacing w:line="360" w:lineRule="auto"/>
+        <w:jc w:val="both"/>
+        <w:rPr>
+          <w:rFonts w:ascii="Arial" w:hAnsi="Arial" w:cs="Arial"/>
+          <w:sz w:val="24"/>
+          <w:szCs w:val="24"/>
+        </w:rPr>
+      </w:pPr>
+      <w:r>
+        <w:rPr>
+          <w:rFonts w:ascii="Arial" w:hAnsi="Arial" w:cs="Arial"/>
+          <w:sz w:val="24"/>
+          <w:szCs w:val="24"/>
+        </w:rPr>
+        <w:t xml:space="preserve"> No projeto III, os algoritmos foram analisados sob diferentes cenários, permitindo uma observação e comparação prática da relação de complexidade teórica e desempenho real. </w:t>
+      </w:r>
+      <w:r>
+        <w:rPr>
+          <w:rFonts w:ascii="Arial" w:hAnsi="Arial" w:cs="Arial"/>
+          <w:sz w:val="24"/>
+          <w:szCs w:val="24"/>
+        </w:rPr>
+        <w:t xml:space="preserve">O </w:t>
+      </w:r>
+      <w:proofErr w:type="spellStart"/>
+      <w:r>
+        <w:rPr>
+          <w:rFonts w:ascii="Arial" w:hAnsi="Arial" w:cs="Arial"/>
+          <w:sz w:val="24"/>
+          <w:szCs w:val="24"/>
+        </w:rPr>
+        <w:t>Insertion</w:t>
+      </w:r>
+      <w:proofErr w:type="spellEnd"/>
+      <w:r>
+        <w:rPr>
+          <w:rFonts w:ascii="Arial" w:hAnsi="Arial" w:cs="Arial"/>
+          <w:sz w:val="24"/>
+          <w:szCs w:val="24"/>
+        </w:rPr>
+        <w:t xml:space="preserve"> </w:t>
+      </w:r>
+      <w:proofErr w:type="spellStart"/>
+      <w:r>
+        <w:rPr>
+          <w:rFonts w:ascii="Arial" w:hAnsi="Arial" w:cs="Arial"/>
+          <w:sz w:val="24"/>
+          <w:szCs w:val="24"/>
+        </w:rPr>
+        <w:t>Sort</w:t>
+      </w:r>
+      <w:proofErr w:type="spellEnd"/>
+      <w:r>
+        <w:rPr>
+          <w:rFonts w:ascii="Arial" w:hAnsi="Arial" w:cs="Arial"/>
+          <w:sz w:val="24"/>
+          <w:szCs w:val="24"/>
+        </w:rPr>
+        <w:t xml:space="preserve"> demonstrou eficiência em casos específicos, enquanto o </w:t>
+      </w:r>
+      <w:proofErr w:type="spellStart"/>
+      <w:r>
+        <w:rPr>
+          <w:rFonts w:ascii="Arial" w:hAnsi="Arial" w:cs="Arial"/>
+          <w:sz w:val="24"/>
+          <w:szCs w:val="24"/>
+        </w:rPr>
+        <w:t>Quick</w:t>
+      </w:r>
+      <w:proofErr w:type="spellEnd"/>
+      <w:r>
+        <w:rPr>
+          <w:rFonts w:ascii="Arial" w:hAnsi="Arial" w:cs="Arial"/>
+          <w:sz w:val="24"/>
+          <w:szCs w:val="24"/>
+        </w:rPr>
+        <w:t xml:space="preserve"> </w:t>
+      </w:r>
+      <w:proofErr w:type="spellStart"/>
+      <w:r>
+        <w:rPr>
+          <w:rFonts w:ascii="Arial" w:hAnsi="Arial" w:cs="Arial"/>
+          <w:sz w:val="24"/>
+          <w:szCs w:val="24"/>
+        </w:rPr>
+        <w:t>Sort</w:t>
+      </w:r>
+      <w:proofErr w:type="spellEnd"/>
+      <w:r>
+        <w:rPr>
+          <w:rFonts w:ascii="Arial" w:hAnsi="Arial" w:cs="Arial"/>
+          <w:sz w:val="24"/>
+          <w:szCs w:val="24"/>
+        </w:rPr>
+        <w:t xml:space="preserve"> apresentou melhor desempenho geral, embora sensível à escolha do pivô, o que pode impactar negativamente sua execução em determinados casos.</w:t>
+      </w:r>
+    </w:p>
+    <w:p>
+      <w:pPr>
+        <w:spacing w:line="360" w:lineRule="auto"/>
+        <w:jc w:val="both"/>
+        <w:rPr>
+          <w:rFonts w:ascii="Arial" w:hAnsi="Arial" w:cs="Arial"/>
+          <w:sz w:val="24"/>
+          <w:szCs w:val="24"/>
+        </w:rPr>
+      </w:pPr>
+      <w:r>
+        <w:rPr>
+          <w:rFonts w:ascii="Arial" w:hAnsi="Arial" w:cs="Arial"/>
+          <w:sz w:val="24"/>
+          <w:szCs w:val="24"/>
+        </w:rPr>
+        <w:t>Os resultados obtidos demonstram que a eficiência de um algoritmo não depende somente de sua complexidade teórica, mas também de características dos dados de entrada e da forma como o algoritmo foi implementado.</w:t>
+      </w:r>
     </w:p>
     <w:p>
       <w:pPr>
@@ -5609,7 +6302,7 @@
 </file>
 
 <file path=word/endnotes.xml><?xml version="1.0" encoding="utf-8"?>
-<w:endnotes xmlns:wpc="http://schemas.microsoft.com/office/word/2010/wordprocessingCanvas" xmlns:cx="http://schemas.microsoft.com/office/drawing/2014/chartex" xmlns:cx1="http://schemas.microsoft.com/office/drawing/2015/9/8/chartex" xmlns:mc="http://schemas.openxmlformats.org/markup-compatibility/2006" xmlns:o="urn:schemas-microsoft-com:office:office" xmlns:r="http://schemas.openxmlformats.org/officeDocument/2006/relationships" xmlns:m="http://schemas.openxmlformats.org/officeDocument/2006/math" xmlns:v="urn:schemas-microsoft-com:vml" xmlns:wp14="http://schemas.microsoft.com/office/word/2010/wordprocessingDrawing" xmlns:wp="http://schemas.openxmlformats.org/drawingml/2006/wordprocessingDrawing" xmlns:w10="urn:schemas-microsoft-com:office:word" xmlns:w="http://schemas.openxmlformats.org/wordprocessingml/2006/main" xmlns:w14="http://schemas.microsoft.com/office/word/2010/wordml" xmlns:w15="http://schemas.microsoft.com/office/word/2012/wordml" xmlns:w16se="http://schemas.microsoft.com/office/word/2015/wordml/symex" xmlns:wpg="http://schemas.microsoft.com/office/word/2010/wordprocessingGroup" xmlns:wpi="http://schemas.microsoft.com/office/word/2010/wordprocessingInk" xmlns:wne="http://schemas.microsoft.com/office/word/2006/wordml" xmlns:wps="http://schemas.microsoft.com/office/word/2010/wordprocessingShape" mc:Ignorable="w14 w15 w16se wp14">
+<w:endnotes xmlns:wpc="http://schemas.microsoft.com/office/word/2010/wordprocessingCanvas" xmlns:cx="http://schemas.microsoft.com/office/drawing/2014/chartex" xmlns:cx1="http://schemas.microsoft.com/office/drawing/2015/9/8/chartex" xmlns:cx2="http://schemas.microsoft.com/office/drawing/2015/10/21/chartex" xmlns:cx3="http://schemas.microsoft.com/office/drawing/2016/5/9/chartex" xmlns:cx4="http://schemas.microsoft.com/office/drawing/2016/5/10/chartex" xmlns:cx5="http://schemas.microsoft.com/office/drawing/2016/5/11/chartex" xmlns:cx6="http://schemas.microsoft.com/office/drawing/2016/5/12/chartex" xmlns:cx7="http://schemas.microsoft.com/office/drawing/2016/5/13/chartex" xmlns:cx8="http://schemas.microsoft.com/office/drawing/2016/5/14/chartex" xmlns:mc="http://schemas.openxmlformats.org/markup-compatibility/2006" xmlns:aink="http://schemas.microsoft.com/office/drawing/2016/ink" xmlns:am3d="http://schemas.microsoft.com/office/drawing/2017/model3d" xmlns:o="urn:schemas-microsoft-com:office:office" xmlns:r="http://schemas.openxmlformats.org/officeDocument/2006/relationships" xmlns:m="http://schemas.openxmlformats.org/officeDocument/2006/math" xmlns:v="urn:schemas-microsoft-com:vml" xmlns:wp14="http://schemas.microsoft.com/office/word/2010/wordprocessingDrawing" xmlns:wp="http://schemas.openxmlformats.org/drawingml/2006/wordprocessingDrawing" xmlns:w10="urn:schemas-microsoft-com:office:word" xmlns:w="http://schemas.openxmlformats.org/wordprocessingml/2006/main" xmlns:w14="http://schemas.microsoft.com/office/word/2010/wordml" xmlns:w15="http://schemas.microsoft.com/office/word/2012/wordml" xmlns:w16cex="http://schemas.microsoft.com/office/word/2018/wordml/cex" xmlns:w16cid="http://schemas.microsoft.com/office/word/2016/wordml/cid" xmlns:w16="http://schemas.microsoft.com/office/word/2018/wordml" xmlns:w16sdtdh="http://schemas.microsoft.com/office/word/2020/wordml/sdtdatahash" xmlns:w16se="http://schemas.microsoft.com/office/word/2015/wordml/symex" xmlns:wpg="http://schemas.microsoft.com/office/word/2010/wordprocessingGroup" xmlns:wpi="http://schemas.microsoft.com/office/word/2010/wordprocessingInk" xmlns:wne="http://schemas.microsoft.com/office/word/2006/wordml" xmlns:wps="http://schemas.microsoft.com/office/word/2010/wordprocessingShape" mc:Ignorable="w14 w15 w16se w16cid w16 w16cex w16sdtdh wp14">
   <w:endnote w:type="separator" w:id="-1">
     <w:p>
       <w:pPr>
@@ -5634,7 +6327,7 @@
 </file>
 
 <file path=word/footer1.xml><?xml version="1.0" encoding="utf-8"?>
-<w:ftr xmlns:wpc="http://schemas.microsoft.com/office/word/2010/wordprocessingCanvas" xmlns:cx="http://schemas.microsoft.com/office/drawing/2014/chartex" xmlns:cx1="http://schemas.microsoft.com/office/drawing/2015/9/8/chartex" xmlns:mc="http://schemas.openxmlformats.org/markup-compatibility/2006" xmlns:o="urn:schemas-microsoft-com:office:office" xmlns:r="http://schemas.openxmlformats.org/officeDocument/2006/relationships" xmlns:m="http://schemas.openxmlformats.org/officeDocument/2006/math" xmlns:v="urn:schemas-microsoft-com:vml" xmlns:wp14="http://schemas.microsoft.com/office/word/2010/wordprocessingDrawing" xmlns:wp="http://schemas.openxmlformats.org/drawingml/2006/wordprocessingDrawing" xmlns:w10="urn:schemas-microsoft-com:office:word" xmlns:w="http://schemas.openxmlformats.org/wordprocessingml/2006/main" xmlns:w14="http://schemas.microsoft.com/office/word/2010/wordml" xmlns:w15="http://schemas.microsoft.com/office/word/2012/wordml" xmlns:w16se="http://schemas.microsoft.com/office/word/2015/wordml/symex" xmlns:wpg="http://schemas.microsoft.com/office/word/2010/wordprocessingGroup" xmlns:wpi="http://schemas.microsoft.com/office/word/2010/wordprocessingInk" xmlns:wne="http://schemas.microsoft.com/office/word/2006/wordml" xmlns:wps="http://schemas.microsoft.com/office/word/2010/wordprocessingShape" mc:Ignorable="w14 w15 w16se wp14">
+<w:ftr xmlns:wpc="http://schemas.microsoft.com/office/word/2010/wordprocessingCanvas" xmlns:cx="http://schemas.microsoft.com/office/drawing/2014/chartex" xmlns:cx1="http://schemas.microsoft.com/office/drawing/2015/9/8/chartex" xmlns:cx2="http://schemas.microsoft.com/office/drawing/2015/10/21/chartex" xmlns:cx3="http://schemas.microsoft.com/office/drawing/2016/5/9/chartex" xmlns:cx4="http://schemas.microsoft.com/office/drawing/2016/5/10/chartex" xmlns:cx5="http://schemas.microsoft.com/office/drawing/2016/5/11/chartex" xmlns:cx6="http://schemas.microsoft.com/office/drawing/2016/5/12/chartex" xmlns:cx7="http://schemas.microsoft.com/office/drawing/2016/5/13/chartex" xmlns:cx8="http://schemas.microsoft.com/office/drawing/2016/5/14/chartex" xmlns:mc="http://schemas.openxmlformats.org/markup-compatibility/2006" xmlns:aink="http://schemas.microsoft.com/office/drawing/2016/ink" xmlns:am3d="http://schemas.microsoft.com/office/drawing/2017/model3d" xmlns:o="urn:schemas-microsoft-com:office:office" xmlns:r="http://schemas.openxmlformats.org/officeDocument/2006/relationships" xmlns:m="http://schemas.openxmlformats.org/officeDocument/2006/math" xmlns:v="urn:schemas-microsoft-com:vml" xmlns:wp14="http://schemas.microsoft.com/office/word/2010/wordprocessingDrawing" xmlns:wp="http://schemas.openxmlformats.org/drawingml/2006/wordprocessingDrawing" xmlns:w10="urn:schemas-microsoft-com:office:word" xmlns:w="http://schemas.openxmlformats.org/wordprocessingml/2006/main" xmlns:w14="http://schemas.microsoft.com/office/word/2010/wordml" xmlns:w15="http://schemas.microsoft.com/office/word/2012/wordml" xmlns:w16cex="http://schemas.microsoft.com/office/word/2018/wordml/cex" xmlns:w16cid="http://schemas.microsoft.com/office/word/2016/wordml/cid" xmlns:w16="http://schemas.microsoft.com/office/word/2018/wordml" xmlns:w16sdtdh="http://schemas.microsoft.com/office/word/2020/wordml/sdtdatahash" xmlns:w16se="http://schemas.microsoft.com/office/word/2015/wordml/symex" xmlns:wpg="http://schemas.microsoft.com/office/word/2010/wordprocessingGroup" xmlns:wpi="http://schemas.microsoft.com/office/word/2010/wordprocessingInk" xmlns:wne="http://schemas.microsoft.com/office/word/2006/wordml" xmlns:wps="http://schemas.microsoft.com/office/word/2010/wordprocessingShape" mc:Ignorable="w14 w15 w16se w16cid w16 w16cex w16sdtdh wp14">
   <w:p>
     <w:pPr>
       <w:pStyle w:val="Rodap"/>
@@ -5649,7 +6342,7 @@
 </file>
 
 <file path=word/footnotes.xml><?xml version="1.0" encoding="utf-8"?>
-<w:footnotes xmlns:wpc="http://schemas.microsoft.com/office/word/2010/wordprocessingCanvas" xmlns:cx="http://schemas.microsoft.com/office/drawing/2014/chartex" xmlns:cx1="http://schemas.microsoft.com/office/drawing/2015/9/8/chartex" xmlns:mc="http://schemas.openxmlformats.org/markup-compatibility/2006" xmlns:o="urn:schemas-microsoft-com:office:office" xmlns:r="http://schemas.openxmlformats.org/officeDocument/2006/relationships" xmlns:m="http://schemas.openxmlformats.org/officeDocument/2006/math" xmlns:v="urn:schemas-microsoft-com:vml" xmlns:wp14="http://schemas.microsoft.com/office/word/2010/wordprocessingDrawing" xmlns:wp="http://schemas.openxmlformats.org/drawingml/2006/wordprocessingDrawing" xmlns:w10="urn:schemas-microsoft-com:office:word" xmlns:w="http://schemas.openxmlformats.org/wordprocessingml/2006/main" xmlns:w14="http://schemas.microsoft.com/office/word/2010/wordml" xmlns:w15="http://schemas.microsoft.com/office/word/2012/wordml" xmlns:w16se="http://schemas.microsoft.com/office/word/2015/wordml/symex" xmlns:wpg="http://schemas.microsoft.com/office/word/2010/wordprocessingGroup" xmlns:wpi="http://schemas.microsoft.com/office/word/2010/wordprocessingInk" xmlns:wne="http://schemas.microsoft.com/office/word/2006/wordml" xmlns:wps="http://schemas.microsoft.com/office/word/2010/wordprocessingShape" mc:Ignorable="w14 w15 w16se wp14">
+<w:footnotes xmlns:wpc="http://schemas.microsoft.com/office/word/2010/wordprocessingCanvas" xmlns:cx="http://schemas.microsoft.com/office/drawing/2014/chartex" xmlns:cx1="http://schemas.microsoft.com/office/drawing/2015/9/8/chartex" xmlns:cx2="http://schemas.microsoft.com/office/drawing/2015/10/21/chartex" xmlns:cx3="http://schemas.microsoft.com/office/drawing/2016/5/9/chartex" xmlns:cx4="http://schemas.microsoft.com/office/drawing/2016/5/10/chartex" xmlns:cx5="http://schemas.microsoft.com/office/drawing/2016/5/11/chartex" xmlns:cx6="http://schemas.microsoft.com/office/drawing/2016/5/12/chartex" xmlns:cx7="http://schemas.microsoft.com/office/drawing/2016/5/13/chartex" xmlns:cx8="http://schemas.microsoft.com/office/drawing/2016/5/14/chartex" xmlns:mc="http://schemas.openxmlformats.org/markup-compatibility/2006" xmlns:aink="http://schemas.microsoft.com/office/drawing/2016/ink" xmlns:am3d="http://schemas.microsoft.com/office/drawing/2017/model3d" xmlns:o="urn:schemas-microsoft-com:office:office" xmlns:r="http://schemas.openxmlformats.org/officeDocument/2006/relationships" xmlns:m="http://schemas.openxmlformats.org/officeDocument/2006/math" xmlns:v="urn:schemas-microsoft-com:vml" xmlns:wp14="http://schemas.microsoft.com/office/word/2010/wordprocessingDrawing" xmlns:wp="http://schemas.openxmlformats.org/drawingml/2006/wordprocessingDrawing" xmlns:w10="urn:schemas-microsoft-com:office:word" xmlns:w="http://schemas.openxmlformats.org/wordprocessingml/2006/main" xmlns:w14="http://schemas.microsoft.com/office/word/2010/wordml" xmlns:w15="http://schemas.microsoft.com/office/word/2012/wordml" xmlns:w16cex="http://schemas.microsoft.com/office/word/2018/wordml/cex" xmlns:w16cid="http://schemas.microsoft.com/office/word/2016/wordml/cid" xmlns:w16="http://schemas.microsoft.com/office/word/2018/wordml" xmlns:w16sdtdh="http://schemas.microsoft.com/office/word/2020/wordml/sdtdatahash" xmlns:w16se="http://schemas.microsoft.com/office/word/2015/wordml/symex" xmlns:wpg="http://schemas.microsoft.com/office/word/2010/wordprocessingGroup" xmlns:wpi="http://schemas.microsoft.com/office/word/2010/wordprocessingInk" xmlns:wne="http://schemas.microsoft.com/office/word/2006/wordml" xmlns:wps="http://schemas.microsoft.com/office/word/2010/wordprocessingShape" mc:Ignorable="w14 w15 w16se w16cid w16 w16cex w16sdtdh wp14">
   <w:footnote w:type="separator" w:id="-1">
     <w:p>
       <w:pPr>
@@ -5674,7 +6367,7 @@
 </file>
 
 <file path=word/header1.xml><?xml version="1.0" encoding="utf-8"?>
-<w:hdr xmlns:wpc="http://schemas.microsoft.com/office/word/2010/wordprocessingCanvas" xmlns:cx="http://schemas.microsoft.com/office/drawing/2014/chartex" xmlns:cx1="http://schemas.microsoft.com/office/drawing/2015/9/8/chartex" xmlns:mc="http://schemas.openxmlformats.org/markup-compatibility/2006" xmlns:o="urn:schemas-microsoft-com:office:office" xmlns:r="http://schemas.openxmlformats.org/officeDocument/2006/relationships" xmlns:m="http://schemas.openxmlformats.org/officeDocument/2006/math" xmlns:v="urn:schemas-microsoft-com:vml" xmlns:wp14="http://schemas.microsoft.com/office/word/2010/wordprocessingDrawing" xmlns:wp="http://schemas.openxmlformats.org/drawingml/2006/wordprocessingDrawing" xmlns:w10="urn:schemas-microsoft-com:office:word" xmlns:w="http://schemas.openxmlformats.org/wordprocessingml/2006/main" xmlns:w14="http://schemas.microsoft.com/office/word/2010/wordml" xmlns:w15="http://schemas.microsoft.com/office/word/2012/wordml" xmlns:w16se="http://schemas.microsoft.com/office/word/2015/wordml/symex" xmlns:wpg="http://schemas.microsoft.com/office/word/2010/wordprocessingGroup" xmlns:wpi="http://schemas.microsoft.com/office/word/2010/wordprocessingInk" xmlns:wne="http://schemas.microsoft.com/office/word/2006/wordml" xmlns:wps="http://schemas.microsoft.com/office/word/2010/wordprocessingShape" mc:Ignorable="w14 w15 w16se wp14">
+<w:hdr xmlns:wpc="http://schemas.microsoft.com/office/word/2010/wordprocessingCanvas" xmlns:cx="http://schemas.microsoft.com/office/drawing/2014/chartex" xmlns:cx1="http://schemas.microsoft.com/office/drawing/2015/9/8/chartex" xmlns:cx2="http://schemas.microsoft.com/office/drawing/2015/10/21/chartex" xmlns:cx3="http://schemas.microsoft.com/office/drawing/2016/5/9/chartex" xmlns:cx4="http://schemas.microsoft.com/office/drawing/2016/5/10/chartex" xmlns:cx5="http://schemas.microsoft.com/office/drawing/2016/5/11/chartex" xmlns:cx6="http://schemas.microsoft.com/office/drawing/2016/5/12/chartex" xmlns:cx7="http://schemas.microsoft.com/office/drawing/2016/5/13/chartex" xmlns:cx8="http://schemas.microsoft.com/office/drawing/2016/5/14/chartex" xmlns:mc="http://schemas.openxmlformats.org/markup-compatibility/2006" xmlns:aink="http://schemas.microsoft.com/office/drawing/2016/ink" xmlns:am3d="http://schemas.microsoft.com/office/drawing/2017/model3d" xmlns:o="urn:schemas-microsoft-com:office:office" xmlns:r="http://schemas.openxmlformats.org/officeDocument/2006/relationships" xmlns:m="http://schemas.openxmlformats.org/officeDocument/2006/math" xmlns:v="urn:schemas-microsoft-com:vml" xmlns:wp14="http://schemas.microsoft.com/office/word/2010/wordprocessingDrawing" xmlns:wp="http://schemas.openxmlformats.org/drawingml/2006/wordprocessingDrawing" xmlns:w10="urn:schemas-microsoft-com:office:word" xmlns:w="http://schemas.openxmlformats.org/wordprocessingml/2006/main" xmlns:w14="http://schemas.microsoft.com/office/word/2010/wordml" xmlns:w15="http://schemas.microsoft.com/office/word/2012/wordml" xmlns:w16cex="http://schemas.microsoft.com/office/word/2018/wordml/cex" xmlns:w16cid="http://schemas.microsoft.com/office/word/2016/wordml/cid" xmlns:w16="http://schemas.microsoft.com/office/word/2018/wordml" xmlns:w16sdtdh="http://schemas.microsoft.com/office/word/2020/wordml/sdtdatahash" xmlns:w16se="http://schemas.microsoft.com/office/word/2015/wordml/symex" xmlns:wpg="http://schemas.microsoft.com/office/word/2010/wordprocessingGroup" xmlns:wpi="http://schemas.microsoft.com/office/word/2010/wordprocessingInk" xmlns:wne="http://schemas.microsoft.com/office/word/2006/wordml" xmlns:wps="http://schemas.microsoft.com/office/word/2010/wordprocessingShape" mc:Ignorable="w14 w15 w16se w16cid w16 w16cex w16sdtdh wp14">
   <w:sdt>
     <w:sdtPr>
       <w:id w:val="18205919"/>
@@ -5683,6 +6376,7 @@
         <w:docPartUnique/>
       </w:docPartObj>
     </w:sdtPr>
+    <w:sdtEndPr/>
     <w:sdtContent>
       <w:p>
         <w:pPr>
@@ -5701,7 +6395,7 @@
 </file>
 
 <file path=word/header2.xml><?xml version="1.0" encoding="utf-8"?>
-<w:hdr xmlns:wpc="http://schemas.microsoft.com/office/word/2010/wordprocessingCanvas" xmlns:cx="http://schemas.microsoft.com/office/drawing/2014/chartex" xmlns:cx1="http://schemas.microsoft.com/office/drawing/2015/9/8/chartex" xmlns:mc="http://schemas.openxmlformats.org/markup-compatibility/2006" xmlns:o="urn:schemas-microsoft-com:office:office" xmlns:r="http://schemas.openxmlformats.org/officeDocument/2006/relationships" xmlns:m="http://schemas.openxmlformats.org/officeDocument/2006/math" xmlns:v="urn:schemas-microsoft-com:vml" xmlns:wp14="http://schemas.microsoft.com/office/word/2010/wordprocessingDrawing" xmlns:wp="http://schemas.openxmlformats.org/drawingml/2006/wordprocessingDrawing" xmlns:w10="urn:schemas-microsoft-com:office:word" xmlns:w="http://schemas.openxmlformats.org/wordprocessingml/2006/main" xmlns:w14="http://schemas.microsoft.com/office/word/2010/wordml" xmlns:w15="http://schemas.microsoft.com/office/word/2012/wordml" xmlns:w16se="http://schemas.microsoft.com/office/word/2015/wordml/symex" xmlns:wpg="http://schemas.microsoft.com/office/word/2010/wordprocessingGroup" xmlns:wpi="http://schemas.microsoft.com/office/word/2010/wordprocessingInk" xmlns:wne="http://schemas.microsoft.com/office/word/2006/wordml" xmlns:wps="http://schemas.microsoft.com/office/word/2010/wordprocessingShape" mc:Ignorable="w14 w15 w16se wp14">
+<w:hdr xmlns:wpc="http://schemas.microsoft.com/office/word/2010/wordprocessingCanvas" xmlns:cx="http://schemas.microsoft.com/office/drawing/2014/chartex" xmlns:cx1="http://schemas.microsoft.com/office/drawing/2015/9/8/chartex" xmlns:cx2="http://schemas.microsoft.com/office/drawing/2015/10/21/chartex" xmlns:cx3="http://schemas.microsoft.com/office/drawing/2016/5/9/chartex" xmlns:cx4="http://schemas.microsoft.com/office/drawing/2016/5/10/chartex" xmlns:cx5="http://schemas.microsoft.com/office/drawing/2016/5/11/chartex" xmlns:cx6="http://schemas.microsoft.com/office/drawing/2016/5/12/chartex" xmlns:cx7="http://schemas.microsoft.com/office/drawing/2016/5/13/chartex" xmlns:cx8="http://schemas.microsoft.com/office/drawing/2016/5/14/chartex" xmlns:mc="http://schemas.openxmlformats.org/markup-compatibility/2006" xmlns:aink="http://schemas.microsoft.com/office/drawing/2016/ink" xmlns:am3d="http://schemas.microsoft.com/office/drawing/2017/model3d" xmlns:o="urn:schemas-microsoft-com:office:office" xmlns:r="http://schemas.openxmlformats.org/officeDocument/2006/relationships" xmlns:m="http://schemas.openxmlformats.org/officeDocument/2006/math" xmlns:v="urn:schemas-microsoft-com:vml" xmlns:wp14="http://schemas.microsoft.com/office/word/2010/wordprocessingDrawing" xmlns:wp="http://schemas.openxmlformats.org/drawingml/2006/wordprocessingDrawing" xmlns:w10="urn:schemas-microsoft-com:office:word" xmlns:w="http://schemas.openxmlformats.org/wordprocessingml/2006/main" xmlns:w14="http://schemas.microsoft.com/office/word/2010/wordml" xmlns:w15="http://schemas.microsoft.com/office/word/2012/wordml" xmlns:w16cex="http://schemas.microsoft.com/office/word/2018/wordml/cex" xmlns:w16cid="http://schemas.microsoft.com/office/word/2016/wordml/cid" xmlns:w16="http://schemas.microsoft.com/office/word/2018/wordml" xmlns:w16sdtdh="http://schemas.microsoft.com/office/word/2020/wordml/sdtdatahash" xmlns:w16se="http://schemas.microsoft.com/office/word/2015/wordml/symex" xmlns:wpg="http://schemas.microsoft.com/office/word/2010/wordprocessingGroup" xmlns:wpi="http://schemas.microsoft.com/office/word/2010/wordprocessingInk" xmlns:wne="http://schemas.microsoft.com/office/word/2006/wordml" xmlns:wps="http://schemas.microsoft.com/office/word/2010/wordprocessingShape" mc:Ignorable="w14 w15 w16se w16cid w16 w16cex w16sdtdh wp14">
   <w:sdt>
     <w:sdtPr>
       <w:id w:val="1076635632"/>
@@ -5710,6 +6404,7 @@
         <w:docPartUnique/>
       </w:docPartObj>
     </w:sdtPr>
+    <w:sdtEndPr/>
     <w:sdtContent>
       <w:p>
         <w:pPr>
@@ -5746,7 +6441,7 @@
 </file>
 
 <file path=word/header3.xml><?xml version="1.0" encoding="utf-8"?>
-<w:hdr xmlns:wpc="http://schemas.microsoft.com/office/word/2010/wordprocessingCanvas" xmlns:cx="http://schemas.microsoft.com/office/drawing/2014/chartex" xmlns:cx1="http://schemas.microsoft.com/office/drawing/2015/9/8/chartex" xmlns:mc="http://schemas.openxmlformats.org/markup-compatibility/2006" xmlns:o="urn:schemas-microsoft-com:office:office" xmlns:r="http://schemas.openxmlformats.org/officeDocument/2006/relationships" xmlns:m="http://schemas.openxmlformats.org/officeDocument/2006/math" xmlns:v="urn:schemas-microsoft-com:vml" xmlns:wp14="http://schemas.microsoft.com/office/word/2010/wordprocessingDrawing" xmlns:wp="http://schemas.openxmlformats.org/drawingml/2006/wordprocessingDrawing" xmlns:w10="urn:schemas-microsoft-com:office:word" xmlns:w="http://schemas.openxmlformats.org/wordprocessingml/2006/main" xmlns:w14="http://schemas.microsoft.com/office/word/2010/wordml" xmlns:w15="http://schemas.microsoft.com/office/word/2012/wordml" xmlns:w16se="http://schemas.microsoft.com/office/word/2015/wordml/symex" xmlns:wpg="http://schemas.microsoft.com/office/word/2010/wordprocessingGroup" xmlns:wpi="http://schemas.microsoft.com/office/word/2010/wordprocessingInk" xmlns:wne="http://schemas.microsoft.com/office/word/2006/wordml" xmlns:wps="http://schemas.microsoft.com/office/word/2010/wordprocessingShape" mc:Ignorable="w14 w15 w16se wp14">
+<w:hdr xmlns:wpc="http://schemas.microsoft.com/office/word/2010/wordprocessingCanvas" xmlns:cx="http://schemas.microsoft.com/office/drawing/2014/chartex" xmlns:cx1="http://schemas.microsoft.com/office/drawing/2015/9/8/chartex" xmlns:cx2="http://schemas.microsoft.com/office/drawing/2015/10/21/chartex" xmlns:cx3="http://schemas.microsoft.com/office/drawing/2016/5/9/chartex" xmlns:cx4="http://schemas.microsoft.com/office/drawing/2016/5/10/chartex" xmlns:cx5="http://schemas.microsoft.com/office/drawing/2016/5/11/chartex" xmlns:cx6="http://schemas.microsoft.com/office/drawing/2016/5/12/chartex" xmlns:cx7="http://schemas.microsoft.com/office/drawing/2016/5/13/chartex" xmlns:cx8="http://schemas.microsoft.com/office/drawing/2016/5/14/chartex" xmlns:mc="http://schemas.openxmlformats.org/markup-compatibility/2006" xmlns:aink="http://schemas.microsoft.com/office/drawing/2016/ink" xmlns:am3d="http://schemas.microsoft.com/office/drawing/2017/model3d" xmlns:o="urn:schemas-microsoft-com:office:office" xmlns:r="http://schemas.openxmlformats.org/officeDocument/2006/relationships" xmlns:m="http://schemas.openxmlformats.org/officeDocument/2006/math" xmlns:v="urn:schemas-microsoft-com:vml" xmlns:wp14="http://schemas.microsoft.com/office/word/2010/wordprocessingDrawing" xmlns:wp="http://schemas.openxmlformats.org/drawingml/2006/wordprocessingDrawing" xmlns:w10="urn:schemas-microsoft-com:office:word" xmlns:w="http://schemas.openxmlformats.org/wordprocessingml/2006/main" xmlns:w14="http://schemas.microsoft.com/office/word/2010/wordml" xmlns:w15="http://schemas.microsoft.com/office/word/2012/wordml" xmlns:w16cex="http://schemas.microsoft.com/office/word/2018/wordml/cex" xmlns:w16cid="http://schemas.microsoft.com/office/word/2016/wordml/cid" xmlns:w16="http://schemas.microsoft.com/office/word/2018/wordml" xmlns:w16sdtdh="http://schemas.microsoft.com/office/word/2020/wordml/sdtdatahash" xmlns:w16se="http://schemas.microsoft.com/office/word/2015/wordml/symex" xmlns:wpg="http://schemas.microsoft.com/office/word/2010/wordprocessingGroup" xmlns:wpi="http://schemas.microsoft.com/office/word/2010/wordprocessingInk" xmlns:wne="http://schemas.microsoft.com/office/word/2006/wordml" xmlns:wps="http://schemas.microsoft.com/office/word/2010/wordprocessingShape" mc:Ignorable="w14 w15 w16se w16cid w16 w16cex w16sdtdh wp14">
   <w:p>
     <w:pPr>
       <w:pStyle w:val="Cabealho"/>
@@ -5769,7 +6464,7 @@
 </file>
 
 <file path=word/numbering.xml><?xml version="1.0" encoding="utf-8"?>
-<w:numbering xmlns:wpc="http://schemas.microsoft.com/office/word/2010/wordprocessingCanvas" xmlns:cx="http://schemas.microsoft.com/office/drawing/2014/chartex" xmlns:cx1="http://schemas.microsoft.com/office/drawing/2015/9/8/chartex" xmlns:mc="http://schemas.openxmlformats.org/markup-compatibility/2006" xmlns:o="urn:schemas-microsoft-com:office:office" xmlns:r="http://schemas.openxmlformats.org/officeDocument/2006/relationships" xmlns:m="http://schemas.openxmlformats.org/officeDocument/2006/math" xmlns:v="urn:schemas-microsoft-com:vml" xmlns:wp14="http://schemas.microsoft.com/office/word/2010/wordprocessingDrawing" xmlns:wp="http://schemas.openxmlformats.org/drawingml/2006/wordprocessingDrawing" xmlns:w10="urn:schemas-microsoft-com:office:word" xmlns:w="http://schemas.openxmlformats.org/wordprocessingml/2006/main" xmlns:w14="http://schemas.microsoft.com/office/word/2010/wordml" xmlns:w15="http://schemas.microsoft.com/office/word/2012/wordml" xmlns:w16se="http://schemas.microsoft.com/office/word/2015/wordml/symex" xmlns:wpg="http://schemas.microsoft.com/office/word/2010/wordprocessingGroup" xmlns:wpi="http://schemas.microsoft.com/office/word/2010/wordprocessingInk" xmlns:wne="http://schemas.microsoft.com/office/word/2006/wordml" xmlns:wps="http://schemas.microsoft.com/office/word/2010/wordprocessingShape" mc:Ignorable="w14 w15 w16se wp14">
+<w:numbering xmlns:wpc="http://schemas.microsoft.com/office/word/2010/wordprocessingCanvas" xmlns:cx="http://schemas.microsoft.com/office/drawing/2014/chartex" xmlns:cx1="http://schemas.microsoft.com/office/drawing/2015/9/8/chartex" xmlns:cx2="http://schemas.microsoft.com/office/drawing/2015/10/21/chartex" xmlns:cx3="http://schemas.microsoft.com/office/drawing/2016/5/9/chartex" xmlns:cx4="http://schemas.microsoft.com/office/drawing/2016/5/10/chartex" xmlns:cx5="http://schemas.microsoft.com/office/drawing/2016/5/11/chartex" xmlns:cx6="http://schemas.microsoft.com/office/drawing/2016/5/12/chartex" xmlns:cx7="http://schemas.microsoft.com/office/drawing/2016/5/13/chartex" xmlns:cx8="http://schemas.microsoft.com/office/drawing/2016/5/14/chartex" xmlns:mc="http://schemas.openxmlformats.org/markup-compatibility/2006" xmlns:aink="http://schemas.microsoft.com/office/drawing/2016/ink" xmlns:am3d="http://schemas.microsoft.com/office/drawing/2017/model3d" xmlns:o="urn:schemas-microsoft-com:office:office" xmlns:r="http://schemas.openxmlformats.org/officeDocument/2006/relationships" xmlns:m="http://schemas.openxmlformats.org/officeDocument/2006/math" xmlns:v="urn:schemas-microsoft-com:vml" xmlns:wp14="http://schemas.microsoft.com/office/word/2010/wordprocessingDrawing" xmlns:wp="http://schemas.openxmlformats.org/drawingml/2006/wordprocessingDrawing" xmlns:w10="urn:schemas-microsoft-com:office:word" xmlns:w="http://schemas.openxmlformats.org/wordprocessingml/2006/main" xmlns:w14="http://schemas.microsoft.com/office/word/2010/wordml" xmlns:w15="http://schemas.microsoft.com/office/word/2012/wordml" xmlns:w16cex="http://schemas.microsoft.com/office/word/2018/wordml/cex" xmlns:w16cid="http://schemas.microsoft.com/office/word/2016/wordml/cid" xmlns:w16="http://schemas.microsoft.com/office/word/2018/wordml" xmlns:w16sdtdh="http://schemas.microsoft.com/office/word/2020/wordml/sdtdatahash" xmlns:w16se="http://schemas.microsoft.com/office/word/2015/wordml/symex" xmlns:wpg="http://schemas.microsoft.com/office/word/2010/wordprocessingGroup" xmlns:wpi="http://schemas.microsoft.com/office/word/2010/wordprocessingInk" xmlns:wne="http://schemas.microsoft.com/office/word/2006/wordml" xmlns:wps="http://schemas.microsoft.com/office/word/2010/wordprocessingShape" mc:Ignorable="w14 w15 w16se w16cid w16 w16cex w16sdtdh wp14">
   <w:abstractNum w:abstractNumId="0" w15:restartNumberingAfterBreak="0">
     <w:nsid w:val="0C21006B"/>
     <w:multiLevelType w:val="multilevel"/>
@@ -6818,7 +7513,7 @@
 </file>
 
 <file path=word/styles.xml><?xml version="1.0" encoding="utf-8"?>
-<w:styles xmlns:mc="http://schemas.openxmlformats.org/markup-compatibility/2006" xmlns:r="http://schemas.openxmlformats.org/officeDocument/2006/relationships" xmlns:w="http://schemas.openxmlformats.org/wordprocessingml/2006/main" xmlns:w14="http://schemas.microsoft.com/office/word/2010/wordml" xmlns:w15="http://schemas.microsoft.com/office/word/2012/wordml" xmlns:w16se="http://schemas.microsoft.com/office/word/2015/wordml/symex" mc:Ignorable="w14 w15 w16se">
+<w:styles xmlns:mc="http://schemas.openxmlformats.org/markup-compatibility/2006" xmlns:r="http://schemas.openxmlformats.org/officeDocument/2006/relationships" xmlns:w="http://schemas.openxmlformats.org/wordprocessingml/2006/main" xmlns:w14="http://schemas.microsoft.com/office/word/2010/wordml" xmlns:w15="http://schemas.microsoft.com/office/word/2012/wordml" xmlns:w16cex="http://schemas.microsoft.com/office/word/2018/wordml/cex" xmlns:w16cid="http://schemas.microsoft.com/office/word/2016/wordml/cid" xmlns:w16="http://schemas.microsoft.com/office/word/2018/wordml" xmlns:w16sdtdh="http://schemas.microsoft.com/office/word/2020/wordml/sdtdatahash" xmlns:w16se="http://schemas.microsoft.com/office/word/2015/wordml/symex" mc:Ignorable="w14 w15 w16se w16cid w16 w16cex w16sdtdh">
   <w:docDefaults>
     <w:rPrDefault>
       <w:rPr>
@@ -6834,7 +7529,7 @@
       </w:pPr>
     </w:pPrDefault>
   </w:docDefaults>
-  <w:latentStyles w:defLockedState="0" w:defUIPriority="99" w:defSemiHidden="0" w:defUnhideWhenUsed="0" w:defQFormat="0" w:count="371">
+  <w:latentStyles w:defLockedState="0" w:defUIPriority="99" w:defSemiHidden="0" w:defUnhideWhenUsed="0" w:defQFormat="0" w:count="376">
     <w:lsdException w:name="Normal" w:uiPriority="0" w:qFormat="1"/>
     <w:lsdException w:name="heading 1" w:uiPriority="9" w:qFormat="1"/>
     <w:lsdException w:name="heading 2" w:semiHidden="1" w:uiPriority="9" w:unhideWhenUsed="1" w:qFormat="1"/>
@@ -6940,7 +7635,6 @@
     <w:lsdException w:name="HTML Sample" w:semiHidden="1" w:unhideWhenUsed="1"/>
     <w:lsdException w:name="HTML Typewriter" w:semiHidden="1" w:unhideWhenUsed="1"/>
     <w:lsdException w:name="HTML Variable" w:semiHidden="1" w:unhideWhenUsed="1"/>
-    <w:lsdException w:name="Normal Table" w:semiHidden="1" w:unhideWhenUsed="1"/>
     <w:lsdException w:name="annotation subject" w:semiHidden="1" w:unhideWhenUsed="1"/>
     <w:lsdException w:name="No List" w:semiHidden="1" w:unhideWhenUsed="1"/>
     <w:lsdException w:name="Outline List 1" w:semiHidden="1" w:unhideWhenUsed="1"/>
@@ -6983,11 +7677,8 @@
     <w:lsdException w:name="Table Contemporary" w:semiHidden="1" w:unhideWhenUsed="1"/>
     <w:lsdException w:name="Table Elegant" w:semiHidden="1" w:unhideWhenUsed="1"/>
     <w:lsdException w:name="Table Professional" w:semiHidden="1" w:unhideWhenUsed="1"/>
-    <w:lsdException w:name="Table Subtle 1" w:semiHidden="1" w:unhideWhenUsed="1"/>
     <w:lsdException w:name="Table Subtle 2" w:semiHidden="1" w:unhideWhenUsed="1"/>
     <w:lsdException w:name="Table Web 1" w:semiHidden="1" w:unhideWhenUsed="1"/>
-    <w:lsdException w:name="Table Web 2" w:semiHidden="1" w:unhideWhenUsed="1"/>
-    <w:lsdException w:name="Table Web 3" w:semiHidden="1" w:unhideWhenUsed="1"/>
     <w:lsdException w:name="Balloon Text" w:semiHidden="1" w:unhideWhenUsed="1"/>
     <w:lsdException w:name="Table Grid" w:uiPriority="39"/>
     <w:lsdException w:name="Table Theme" w:semiHidden="1" w:unhideWhenUsed="1"/>
@@ -7206,6 +7897,11 @@
     <w:lsdException w:name="List Table 5 Dark Accent 6" w:uiPriority="50"/>
     <w:lsdException w:name="List Table 6 Colorful Accent 6" w:uiPriority="51"/>
     <w:lsdException w:name="List Table 7 Colorful Accent 6" w:uiPriority="52"/>
+    <w:lsdException w:name="Mention" w:semiHidden="1" w:unhideWhenUsed="1"/>
+    <w:lsdException w:name="Smart Hyperlink" w:semiHidden="1" w:unhideWhenUsed="1"/>
+    <w:lsdException w:name="Hashtag" w:semiHidden="1" w:unhideWhenUsed="1"/>
+    <w:lsdException w:name="Unresolved Mention" w:semiHidden="1" w:unhideWhenUsed="1"/>
+    <w:lsdException w:name="Smart Link" w:semiHidden="1" w:unhideWhenUsed="1"/>
   </w:latentStyles>
   <w:style w:type="paragraph" w:default="1" w:styleId="Normal">
     <w:name w:val="Normal"/>

</xml_diff>